<commit_message>
add new viewer, tests and excalidraw
</commit_message>
<xml_diff>
--- a/reviews/BCSE497J Project I Report - 12385UG03.docx
+++ b/reviews/BCSE497J Project I Report - 12385UG03.docx
@@ -907,7 +907,7 @@
           <w:sz w:val="20"/>
         </w:rPr>
         <w:drawing>
-          <wp:anchor distT="0" distB="0" distL="0" distR="0" simplePos="0" relativeHeight="115" behindDoc="0" locked="0" layoutInCell="0" allowOverlap="1">
+          <wp:anchor distT="0" distB="0" distL="0" distR="0" simplePos="0" relativeHeight="121" behindDoc="0" locked="0" layoutInCell="0" allowOverlap="1">
             <wp:simplePos x="0" y="0"/>
             <wp:positionH relativeFrom="margin">
               <wp:posOffset>1113790</wp:posOffset>
@@ -7986,8 +7986,8 @@
       </w:tblPr>
       <w:tblGrid>
         <w:gridCol w:w="1300"/>
-        <w:gridCol w:w="6298"/>
-        <w:gridCol w:w="1302"/>
+        <w:gridCol w:w="6297"/>
+        <w:gridCol w:w="1303"/>
       </w:tblGrid>
       <w:tr>
         <w:trPr>
@@ -8035,7 +8035,7 @@
         </w:tc>
         <w:tc>
           <w:tcPr>
-            <w:tcW w:w="6298" w:type="dxa"/>
+            <w:tcW w:w="6297" w:type="dxa"/>
             <w:tcBorders/>
           </w:tcPr>
           <w:p>
@@ -8060,7 +8060,7 @@
         </w:tc>
         <w:tc>
           <w:tcPr>
-            <w:tcW w:w="1302" w:type="dxa"/>
+            <w:tcW w:w="1303" w:type="dxa"/>
             <w:tcBorders/>
           </w:tcPr>
           <w:p>
@@ -8128,7 +8128,7 @@
         </w:tc>
         <w:tc>
           <w:tcPr>
-            <w:tcW w:w="6298" w:type="dxa"/>
+            <w:tcW w:w="6297" w:type="dxa"/>
             <w:tcBorders/>
           </w:tcPr>
           <w:p>
@@ -8150,7 +8150,7 @@
         </w:tc>
         <w:tc>
           <w:tcPr>
-            <w:tcW w:w="1302" w:type="dxa"/>
+            <w:tcW w:w="1303" w:type="dxa"/>
             <w:tcBorders/>
           </w:tcPr>
           <w:p>
@@ -8205,7 +8205,7 @@
         </w:tc>
         <w:tc>
           <w:tcPr>
-            <w:tcW w:w="6298" w:type="dxa"/>
+            <w:tcW w:w="6297" w:type="dxa"/>
             <w:tcBorders/>
           </w:tcPr>
           <w:p>
@@ -8227,7 +8227,7 @@
         </w:tc>
         <w:tc>
           <w:tcPr>
-            <w:tcW w:w="1302" w:type="dxa"/>
+            <w:tcW w:w="1303" w:type="dxa"/>
             <w:tcBorders/>
           </w:tcPr>
           <w:p>
@@ -8282,7 +8282,7 @@
         </w:tc>
         <w:tc>
           <w:tcPr>
-            <w:tcW w:w="6298" w:type="dxa"/>
+            <w:tcW w:w="6297" w:type="dxa"/>
             <w:tcBorders/>
           </w:tcPr>
           <w:p>
@@ -8304,7 +8304,7 @@
         </w:tc>
         <w:tc>
           <w:tcPr>
-            <w:tcW w:w="1302" w:type="dxa"/>
+            <w:tcW w:w="1303" w:type="dxa"/>
             <w:tcBorders/>
           </w:tcPr>
           <w:p>
@@ -8359,7 +8359,7 @@
         </w:tc>
         <w:tc>
           <w:tcPr>
-            <w:tcW w:w="6298" w:type="dxa"/>
+            <w:tcW w:w="6297" w:type="dxa"/>
             <w:tcBorders/>
           </w:tcPr>
           <w:p>
@@ -8381,7 +8381,7 @@
         </w:tc>
         <w:tc>
           <w:tcPr>
-            <w:tcW w:w="1302" w:type="dxa"/>
+            <w:tcW w:w="1303" w:type="dxa"/>
             <w:tcBorders/>
           </w:tcPr>
           <w:p>
@@ -8436,7 +8436,7 @@
         </w:tc>
         <w:tc>
           <w:tcPr>
-            <w:tcW w:w="6298" w:type="dxa"/>
+            <w:tcW w:w="6297" w:type="dxa"/>
             <w:tcBorders/>
           </w:tcPr>
           <w:p>
@@ -8458,7 +8458,7 @@
         </w:tc>
         <w:tc>
           <w:tcPr>
-            <w:tcW w:w="1302" w:type="dxa"/>
+            <w:tcW w:w="1303" w:type="dxa"/>
             <w:tcBorders/>
           </w:tcPr>
           <w:p>
@@ -8513,7 +8513,7 @@
         </w:tc>
         <w:tc>
           <w:tcPr>
-            <w:tcW w:w="6298" w:type="dxa"/>
+            <w:tcW w:w="6297" w:type="dxa"/>
             <w:tcBorders/>
           </w:tcPr>
           <w:p>
@@ -8535,7 +8535,7 @@
         </w:tc>
         <w:tc>
           <w:tcPr>
-            <w:tcW w:w="1302" w:type="dxa"/>
+            <w:tcW w:w="1303" w:type="dxa"/>
             <w:tcBorders/>
           </w:tcPr>
           <w:p>
@@ -8590,7 +8590,7 @@
         </w:tc>
         <w:tc>
           <w:tcPr>
-            <w:tcW w:w="6298" w:type="dxa"/>
+            <w:tcW w:w="6297" w:type="dxa"/>
             <w:tcBorders/>
           </w:tcPr>
           <w:p>
@@ -8612,7 +8612,7 @@
         </w:tc>
         <w:tc>
           <w:tcPr>
-            <w:tcW w:w="1302" w:type="dxa"/>
+            <w:tcW w:w="1303" w:type="dxa"/>
             <w:tcBorders/>
           </w:tcPr>
           <w:p>
@@ -8667,7 +8667,7 @@
         </w:tc>
         <w:tc>
           <w:tcPr>
-            <w:tcW w:w="6298" w:type="dxa"/>
+            <w:tcW w:w="6297" w:type="dxa"/>
             <w:tcBorders/>
           </w:tcPr>
           <w:p>
@@ -8689,7 +8689,7 @@
         </w:tc>
         <w:tc>
           <w:tcPr>
-            <w:tcW w:w="1302" w:type="dxa"/>
+            <w:tcW w:w="1303" w:type="dxa"/>
             <w:tcBorders/>
           </w:tcPr>
           <w:p>
@@ -8744,7 +8744,7 @@
         </w:tc>
         <w:tc>
           <w:tcPr>
-            <w:tcW w:w="6298" w:type="dxa"/>
+            <w:tcW w:w="6297" w:type="dxa"/>
             <w:tcBorders/>
           </w:tcPr>
           <w:p>
@@ -8766,7 +8766,7 @@
         </w:tc>
         <w:tc>
           <w:tcPr>
-            <w:tcW w:w="1302" w:type="dxa"/>
+            <w:tcW w:w="1303" w:type="dxa"/>
             <w:tcBorders/>
           </w:tcPr>
           <w:p>
@@ -8821,7 +8821,7 @@
         </w:tc>
         <w:tc>
           <w:tcPr>
-            <w:tcW w:w="6298" w:type="dxa"/>
+            <w:tcW w:w="6297" w:type="dxa"/>
             <w:tcBorders/>
           </w:tcPr>
           <w:p>
@@ -8843,7 +8843,7 @@
         </w:tc>
         <w:tc>
           <w:tcPr>
-            <w:tcW w:w="1302" w:type="dxa"/>
+            <w:tcW w:w="1303" w:type="dxa"/>
             <w:tcBorders/>
           </w:tcPr>
           <w:p>
@@ -8898,7 +8898,7 @@
         </w:tc>
         <w:tc>
           <w:tcPr>
-            <w:tcW w:w="6298" w:type="dxa"/>
+            <w:tcW w:w="6297" w:type="dxa"/>
             <w:tcBorders/>
           </w:tcPr>
           <w:p>
@@ -8920,7 +8920,7 @@
         </w:tc>
         <w:tc>
           <w:tcPr>
-            <w:tcW w:w="1302" w:type="dxa"/>
+            <w:tcW w:w="1303" w:type="dxa"/>
             <w:tcBorders/>
           </w:tcPr>
           <w:p>
@@ -8975,7 +8975,7 @@
         </w:tc>
         <w:tc>
           <w:tcPr>
-            <w:tcW w:w="6298" w:type="dxa"/>
+            <w:tcW w:w="6297" w:type="dxa"/>
             <w:tcBorders/>
           </w:tcPr>
           <w:p>
@@ -8997,7 +8997,7 @@
         </w:tc>
         <w:tc>
           <w:tcPr>
-            <w:tcW w:w="1302" w:type="dxa"/>
+            <w:tcW w:w="1303" w:type="dxa"/>
             <w:tcBorders/>
           </w:tcPr>
           <w:p>
@@ -9052,7 +9052,7 @@
         </w:tc>
         <w:tc>
           <w:tcPr>
-            <w:tcW w:w="6298" w:type="dxa"/>
+            <w:tcW w:w="6297" w:type="dxa"/>
             <w:tcBorders/>
           </w:tcPr>
           <w:p>
@@ -9074,7 +9074,7 @@
         </w:tc>
         <w:tc>
           <w:tcPr>
-            <w:tcW w:w="1302" w:type="dxa"/>
+            <w:tcW w:w="1303" w:type="dxa"/>
             <w:tcBorders/>
           </w:tcPr>
           <w:p>
@@ -9129,7 +9129,7 @@
         </w:tc>
         <w:tc>
           <w:tcPr>
-            <w:tcW w:w="6298" w:type="dxa"/>
+            <w:tcW w:w="6297" w:type="dxa"/>
             <w:tcBorders/>
           </w:tcPr>
           <w:p>
@@ -9151,7 +9151,7 @@
         </w:tc>
         <w:tc>
           <w:tcPr>
-            <w:tcW w:w="1302" w:type="dxa"/>
+            <w:tcW w:w="1303" w:type="dxa"/>
             <w:tcBorders/>
           </w:tcPr>
           <w:p>
@@ -9206,7 +9206,7 @@
         </w:tc>
         <w:tc>
           <w:tcPr>
-            <w:tcW w:w="6298" w:type="dxa"/>
+            <w:tcW w:w="6297" w:type="dxa"/>
             <w:tcBorders/>
           </w:tcPr>
           <w:p>
@@ -9228,7 +9228,7 @@
         </w:tc>
         <w:tc>
           <w:tcPr>
-            <w:tcW w:w="1302" w:type="dxa"/>
+            <w:tcW w:w="1303" w:type="dxa"/>
             <w:tcBorders/>
           </w:tcPr>
           <w:p>
@@ -9283,7 +9283,7 @@
         </w:tc>
         <w:tc>
           <w:tcPr>
-            <w:tcW w:w="6298" w:type="dxa"/>
+            <w:tcW w:w="6297" w:type="dxa"/>
             <w:tcBorders/>
           </w:tcPr>
           <w:p>
@@ -9305,7 +9305,7 @@
         </w:tc>
         <w:tc>
           <w:tcPr>
-            <w:tcW w:w="1302" w:type="dxa"/>
+            <w:tcW w:w="1303" w:type="dxa"/>
             <w:tcBorders/>
           </w:tcPr>
           <w:p>
@@ -9453,8 +9453,8 @@
       </w:tblPr>
       <w:tblGrid>
         <w:gridCol w:w="1300"/>
-        <w:gridCol w:w="6298"/>
-        <w:gridCol w:w="1302"/>
+        <w:gridCol w:w="6297"/>
+        <w:gridCol w:w="1303"/>
       </w:tblGrid>
       <w:tr>
         <w:trPr>
@@ -9487,7 +9487,7 @@
         </w:tc>
         <w:tc>
           <w:tcPr>
-            <w:tcW w:w="6298" w:type="dxa"/>
+            <w:tcW w:w="6297" w:type="dxa"/>
             <w:tcBorders/>
           </w:tcPr>
           <w:p>
@@ -9512,7 +9512,7 @@
         </w:tc>
         <w:tc>
           <w:tcPr>
-            <w:tcW w:w="1302" w:type="dxa"/>
+            <w:tcW w:w="1303" w:type="dxa"/>
             <w:tcBorders/>
           </w:tcPr>
           <w:p>
@@ -9580,7 +9580,7 @@
         </w:tc>
         <w:tc>
           <w:tcPr>
-            <w:tcW w:w="6298" w:type="dxa"/>
+            <w:tcW w:w="6297" w:type="dxa"/>
             <w:tcBorders/>
           </w:tcPr>
           <w:p>
@@ -9602,7 +9602,7 @@
         </w:tc>
         <w:tc>
           <w:tcPr>
-            <w:tcW w:w="1302" w:type="dxa"/>
+            <w:tcW w:w="1303" w:type="dxa"/>
             <w:tcBorders/>
           </w:tcPr>
           <w:p>
@@ -9657,7 +9657,7 @@
         </w:tc>
         <w:tc>
           <w:tcPr>
-            <w:tcW w:w="6298" w:type="dxa"/>
+            <w:tcW w:w="6297" w:type="dxa"/>
             <w:tcBorders/>
           </w:tcPr>
           <w:p>
@@ -9679,7 +9679,7 @@
         </w:tc>
         <w:tc>
           <w:tcPr>
-            <w:tcW w:w="1302" w:type="dxa"/>
+            <w:tcW w:w="1303" w:type="dxa"/>
             <w:tcBorders/>
           </w:tcPr>
           <w:p>
@@ -9734,7 +9734,7 @@
         </w:tc>
         <w:tc>
           <w:tcPr>
-            <w:tcW w:w="6298" w:type="dxa"/>
+            <w:tcW w:w="6297" w:type="dxa"/>
             <w:tcBorders/>
           </w:tcPr>
           <w:p>
@@ -9756,7 +9756,7 @@
         </w:tc>
         <w:tc>
           <w:tcPr>
-            <w:tcW w:w="1302" w:type="dxa"/>
+            <w:tcW w:w="1303" w:type="dxa"/>
             <w:tcBorders/>
           </w:tcPr>
           <w:p>
@@ -9811,7 +9811,7 @@
         </w:tc>
         <w:tc>
           <w:tcPr>
-            <w:tcW w:w="6298" w:type="dxa"/>
+            <w:tcW w:w="6297" w:type="dxa"/>
             <w:tcBorders/>
           </w:tcPr>
           <w:p>
@@ -9833,7 +9833,7 @@
         </w:tc>
         <w:tc>
           <w:tcPr>
-            <w:tcW w:w="1302" w:type="dxa"/>
+            <w:tcW w:w="1303" w:type="dxa"/>
             <w:tcBorders/>
           </w:tcPr>
           <w:p>
@@ -9888,7 +9888,7 @@
         </w:tc>
         <w:tc>
           <w:tcPr>
-            <w:tcW w:w="6298" w:type="dxa"/>
+            <w:tcW w:w="6297" w:type="dxa"/>
             <w:tcBorders/>
           </w:tcPr>
           <w:p>
@@ -9910,7 +9910,7 @@
         </w:tc>
         <w:tc>
           <w:tcPr>
-            <w:tcW w:w="1302" w:type="dxa"/>
+            <w:tcW w:w="1303" w:type="dxa"/>
             <w:tcBorders/>
           </w:tcPr>
           <w:p>
@@ -9965,7 +9965,7 @@
         </w:tc>
         <w:tc>
           <w:tcPr>
-            <w:tcW w:w="6298" w:type="dxa"/>
+            <w:tcW w:w="6297" w:type="dxa"/>
             <w:tcBorders/>
           </w:tcPr>
           <w:p>
@@ -9987,7 +9987,7 @@
         </w:tc>
         <w:tc>
           <w:tcPr>
-            <w:tcW w:w="1302" w:type="dxa"/>
+            <w:tcW w:w="1303" w:type="dxa"/>
             <w:tcBorders/>
           </w:tcPr>
           <w:p>
@@ -10042,7 +10042,7 @@
         </w:tc>
         <w:tc>
           <w:tcPr>
-            <w:tcW w:w="6298" w:type="dxa"/>
+            <w:tcW w:w="6297" w:type="dxa"/>
             <w:tcBorders/>
           </w:tcPr>
           <w:p>
@@ -10064,7 +10064,7 @@
         </w:tc>
         <w:tc>
           <w:tcPr>
-            <w:tcW w:w="1302" w:type="dxa"/>
+            <w:tcW w:w="1303" w:type="dxa"/>
             <w:tcBorders/>
           </w:tcPr>
           <w:p>
@@ -10119,7 +10119,7 @@
         </w:tc>
         <w:tc>
           <w:tcPr>
-            <w:tcW w:w="6298" w:type="dxa"/>
+            <w:tcW w:w="6297" w:type="dxa"/>
             <w:tcBorders/>
           </w:tcPr>
           <w:p>
@@ -10141,7 +10141,7 @@
         </w:tc>
         <w:tc>
           <w:tcPr>
-            <w:tcW w:w="1302" w:type="dxa"/>
+            <w:tcW w:w="1303" w:type="dxa"/>
             <w:tcBorders/>
           </w:tcPr>
           <w:p>
@@ -10196,7 +10196,7 @@
         </w:tc>
         <w:tc>
           <w:tcPr>
-            <w:tcW w:w="6298" w:type="dxa"/>
+            <w:tcW w:w="6297" w:type="dxa"/>
             <w:tcBorders/>
           </w:tcPr>
           <w:p>
@@ -10218,7 +10218,7 @@
         </w:tc>
         <w:tc>
           <w:tcPr>
-            <w:tcW w:w="1302" w:type="dxa"/>
+            <w:tcW w:w="1303" w:type="dxa"/>
             <w:tcBorders/>
           </w:tcPr>
           <w:p>
@@ -10273,7 +10273,7 @@
         </w:tc>
         <w:tc>
           <w:tcPr>
-            <w:tcW w:w="6298" w:type="dxa"/>
+            <w:tcW w:w="6297" w:type="dxa"/>
             <w:tcBorders/>
           </w:tcPr>
           <w:p>
@@ -10295,7 +10295,7 @@
         </w:tc>
         <w:tc>
           <w:tcPr>
-            <w:tcW w:w="1302" w:type="dxa"/>
+            <w:tcW w:w="1303" w:type="dxa"/>
             <w:tcBorders/>
           </w:tcPr>
           <w:p>
@@ -10350,7 +10350,7 @@
         </w:tc>
         <w:tc>
           <w:tcPr>
-            <w:tcW w:w="6298" w:type="dxa"/>
+            <w:tcW w:w="6297" w:type="dxa"/>
             <w:tcBorders/>
           </w:tcPr>
           <w:p>
@@ -10372,7 +10372,7 @@
         </w:tc>
         <w:tc>
           <w:tcPr>
-            <w:tcW w:w="1302" w:type="dxa"/>
+            <w:tcW w:w="1303" w:type="dxa"/>
             <w:tcBorders/>
           </w:tcPr>
           <w:p>
@@ -10427,7 +10427,7 @@
         </w:tc>
         <w:tc>
           <w:tcPr>
-            <w:tcW w:w="6298" w:type="dxa"/>
+            <w:tcW w:w="6297" w:type="dxa"/>
             <w:tcBorders/>
           </w:tcPr>
           <w:p>
@@ -10449,7 +10449,7 @@
         </w:tc>
         <w:tc>
           <w:tcPr>
-            <w:tcW w:w="1302" w:type="dxa"/>
+            <w:tcW w:w="1303" w:type="dxa"/>
             <w:tcBorders/>
           </w:tcPr>
           <w:p>
@@ -10504,7 +10504,7 @@
         </w:tc>
         <w:tc>
           <w:tcPr>
-            <w:tcW w:w="6298" w:type="dxa"/>
+            <w:tcW w:w="6297" w:type="dxa"/>
             <w:tcBorders/>
           </w:tcPr>
           <w:p>
@@ -10526,7 +10526,7 @@
         </w:tc>
         <w:tc>
           <w:tcPr>
-            <w:tcW w:w="1302" w:type="dxa"/>
+            <w:tcW w:w="1303" w:type="dxa"/>
             <w:tcBorders/>
           </w:tcPr>
           <w:p>
@@ -10581,7 +10581,7 @@
         </w:tc>
         <w:tc>
           <w:tcPr>
-            <w:tcW w:w="6298" w:type="dxa"/>
+            <w:tcW w:w="6297" w:type="dxa"/>
             <w:tcBorders/>
           </w:tcPr>
           <w:p>
@@ -10603,7 +10603,7 @@
         </w:tc>
         <w:tc>
           <w:tcPr>
-            <w:tcW w:w="1302" w:type="dxa"/>
+            <w:tcW w:w="1303" w:type="dxa"/>
             <w:tcBorders/>
           </w:tcPr>
           <w:p>
@@ -10658,7 +10658,7 @@
         </w:tc>
         <w:tc>
           <w:tcPr>
-            <w:tcW w:w="6298" w:type="dxa"/>
+            <w:tcW w:w="6297" w:type="dxa"/>
             <w:tcBorders/>
           </w:tcPr>
           <w:p>
@@ -10680,7 +10680,7 @@
         </w:tc>
         <w:tc>
           <w:tcPr>
-            <w:tcW w:w="1302" w:type="dxa"/>
+            <w:tcW w:w="1303" w:type="dxa"/>
             <w:tcBorders/>
           </w:tcPr>
           <w:p>
@@ -10735,7 +10735,7 @@
         </w:tc>
         <w:tc>
           <w:tcPr>
-            <w:tcW w:w="6298" w:type="dxa"/>
+            <w:tcW w:w="6297" w:type="dxa"/>
             <w:tcBorders/>
           </w:tcPr>
           <w:p>
@@ -10757,7 +10757,7 @@
         </w:tc>
         <w:tc>
           <w:tcPr>
-            <w:tcW w:w="1302" w:type="dxa"/>
+            <w:tcW w:w="1303" w:type="dxa"/>
             <w:tcBorders/>
           </w:tcPr>
           <w:p>
@@ -10812,7 +10812,7 @@
         </w:tc>
         <w:tc>
           <w:tcPr>
-            <w:tcW w:w="6298" w:type="dxa"/>
+            <w:tcW w:w="6297" w:type="dxa"/>
             <w:tcBorders/>
           </w:tcPr>
           <w:p>
@@ -10834,7 +10834,7 @@
         </w:tc>
         <w:tc>
           <w:tcPr>
-            <w:tcW w:w="1302" w:type="dxa"/>
+            <w:tcW w:w="1303" w:type="dxa"/>
             <w:tcBorders/>
           </w:tcPr>
           <w:p>
@@ -11936,7 +11936,34 @@
           <w:i w:val="false"/>
           <w:sz w:val="24"/>
         </w:rPr>
-        <w:t>We built an API-independent agent that learns the states and behaviour of an unfamiliar application from its pixels, then uses that knowledge to make automation cheaper and more reliable.</w:t>
+        <w:t>Our aim was to create an</w:t>
+      </w:r>
+      <w:r>
+        <w:rPr>
+          <w:rFonts w:eastAsia="Times New Roman" w:cs="Times New Roman"/>
+          <w:b w:val="false"/>
+          <w:i w:val="false"/>
+          <w:sz w:val="24"/>
+        </w:rPr>
+        <w:t xml:space="preserve"> API-independent agent that learns the states and behaviour of an unfamiliar application from its pixels. </w:t>
+      </w:r>
+      <w:r>
+        <w:rPr>
+          <w:rFonts w:eastAsia="Times New Roman" w:cs="Times New Roman"/>
+          <w:b w:val="false"/>
+          <w:i w:val="false"/>
+          <w:sz w:val="24"/>
+        </w:rPr>
+        <w:t xml:space="preserve">It must then </w:t>
+      </w:r>
+      <w:r>
+        <w:rPr>
+          <w:rFonts w:eastAsia="Times New Roman" w:cs="Times New Roman"/>
+          <w:b w:val="false"/>
+          <w:i w:val="false"/>
+          <w:sz w:val="24"/>
+        </w:rPr>
+        <w:t>use that knowledge to make automation cheaper and more reliable.</w:t>
       </w:r>
     </w:p>
     <w:p>
@@ -12603,8 +12630,8 @@
         <w:tblLook w:noHBand="0" w:noVBand="1" w:firstColumn="1" w:lastRow="0" w:lastColumn="0" w:firstRow="1" w:val="04a0"/>
       </w:tblPr>
       <w:tblGrid>
-        <w:gridCol w:w="2298"/>
-        <w:gridCol w:w="2402"/>
+        <w:gridCol w:w="2297"/>
+        <w:gridCol w:w="2403"/>
         <w:gridCol w:w="2000"/>
         <w:gridCol w:w="2400"/>
       </w:tblGrid>
@@ -12615,7 +12642,7 @@
         </w:trPr>
         <w:tc>
           <w:tcPr>
-            <w:tcW w:w="2298" w:type="dxa"/>
+            <w:tcW w:w="2297" w:type="dxa"/>
             <w:tcBorders/>
             <w:shd w:color="auto" w:fill="D9D9D9" w:val="clear"/>
           </w:tcPr>
@@ -12648,7 +12675,7 @@
         </w:tc>
         <w:tc>
           <w:tcPr>
-            <w:tcW w:w="2402" w:type="dxa"/>
+            <w:tcW w:w="2403" w:type="dxa"/>
             <w:tcBorders/>
             <w:shd w:color="auto" w:fill="D9D9D9" w:val="clear"/>
           </w:tcPr>
@@ -12752,7 +12779,7 @@
         </w:trPr>
         <w:tc>
           <w:tcPr>
-            <w:tcW w:w="2298" w:type="dxa"/>
+            <w:tcW w:w="2297" w:type="dxa"/>
             <w:tcBorders/>
           </w:tcPr>
           <w:p>
@@ -12784,7 +12811,7 @@
         </w:tc>
         <w:tc>
           <w:tcPr>
-            <w:tcW w:w="2402" w:type="dxa"/>
+            <w:tcW w:w="2403" w:type="dxa"/>
             <w:tcBorders/>
           </w:tcPr>
           <w:p>
@@ -12885,7 +12912,7 @@
         </w:trPr>
         <w:tc>
           <w:tcPr>
-            <w:tcW w:w="2298" w:type="dxa"/>
+            <w:tcW w:w="2297" w:type="dxa"/>
             <w:tcBorders/>
           </w:tcPr>
           <w:p>
@@ -12917,7 +12944,7 @@
         </w:tc>
         <w:tc>
           <w:tcPr>
-            <w:tcW w:w="2402" w:type="dxa"/>
+            <w:tcW w:w="2403" w:type="dxa"/>
             <w:tcBorders/>
           </w:tcPr>
           <w:p>
@@ -13018,7 +13045,7 @@
         </w:trPr>
         <w:tc>
           <w:tcPr>
-            <w:tcW w:w="2298" w:type="dxa"/>
+            <w:tcW w:w="2297" w:type="dxa"/>
             <w:tcBorders/>
           </w:tcPr>
           <w:p>
@@ -13050,7 +13077,7 @@
         </w:tc>
         <w:tc>
           <w:tcPr>
-            <w:tcW w:w="2402" w:type="dxa"/>
+            <w:tcW w:w="2403" w:type="dxa"/>
             <w:tcBorders/>
           </w:tcPr>
           <w:p>
@@ -13151,7 +13178,7 @@
         </w:trPr>
         <w:tc>
           <w:tcPr>
-            <w:tcW w:w="2298" w:type="dxa"/>
+            <w:tcW w:w="2297" w:type="dxa"/>
             <w:tcBorders/>
           </w:tcPr>
           <w:p>
@@ -13183,7 +13210,7 @@
         </w:tc>
         <w:tc>
           <w:tcPr>
-            <w:tcW w:w="2402" w:type="dxa"/>
+            <w:tcW w:w="2403" w:type="dxa"/>
             <w:tcBorders/>
           </w:tcPr>
           <w:p>
@@ -13284,7 +13311,7 @@
         </w:trPr>
         <w:tc>
           <w:tcPr>
-            <w:tcW w:w="2298" w:type="dxa"/>
+            <w:tcW w:w="2297" w:type="dxa"/>
             <w:tcBorders/>
           </w:tcPr>
           <w:p>
@@ -13316,7 +13343,7 @@
         </w:tc>
         <w:tc>
           <w:tcPr>
-            <w:tcW w:w="2402" w:type="dxa"/>
+            <w:tcW w:w="2403" w:type="dxa"/>
             <w:tcBorders/>
           </w:tcPr>
           <w:p>
@@ -13417,7 +13444,7 @@
         </w:trPr>
         <w:tc>
           <w:tcPr>
-            <w:tcW w:w="2298" w:type="dxa"/>
+            <w:tcW w:w="2297" w:type="dxa"/>
             <w:tcBorders/>
           </w:tcPr>
           <w:p>
@@ -13449,7 +13476,7 @@
         </w:tc>
         <w:tc>
           <w:tcPr>
-            <w:tcW w:w="2402" w:type="dxa"/>
+            <w:tcW w:w="2403" w:type="dxa"/>
             <w:tcBorders/>
           </w:tcPr>
           <w:p>
@@ -13550,7 +13577,7 @@
         </w:trPr>
         <w:tc>
           <w:tcPr>
-            <w:tcW w:w="2298" w:type="dxa"/>
+            <w:tcW w:w="2297" w:type="dxa"/>
             <w:tcBorders/>
           </w:tcPr>
           <w:p>
@@ -13582,7 +13609,7 @@
         </w:tc>
         <w:tc>
           <w:tcPr>
-            <w:tcW w:w="2402" w:type="dxa"/>
+            <w:tcW w:w="2403" w:type="dxa"/>
             <w:tcBorders/>
           </w:tcPr>
           <w:p>
@@ -13683,7 +13710,7 @@
         </w:trPr>
         <w:tc>
           <w:tcPr>
-            <w:tcW w:w="2298" w:type="dxa"/>
+            <w:tcW w:w="2297" w:type="dxa"/>
             <w:tcBorders/>
           </w:tcPr>
           <w:p>
@@ -13715,7 +13742,7 @@
         </w:tc>
         <w:tc>
           <w:tcPr>
-            <w:tcW w:w="2402" w:type="dxa"/>
+            <w:tcW w:w="2403" w:type="dxa"/>
             <w:tcBorders/>
           </w:tcPr>
           <w:p>
@@ -13816,7 +13843,7 @@
         </w:trPr>
         <w:tc>
           <w:tcPr>
-            <w:tcW w:w="2298" w:type="dxa"/>
+            <w:tcW w:w="2297" w:type="dxa"/>
             <w:tcBorders/>
           </w:tcPr>
           <w:p>
@@ -13848,7 +13875,7 @@
         </w:tc>
         <w:tc>
           <w:tcPr>
-            <w:tcW w:w="2402" w:type="dxa"/>
+            <w:tcW w:w="2403" w:type="dxa"/>
             <w:tcBorders/>
           </w:tcPr>
           <w:p>
@@ -13949,7 +13976,7 @@
         </w:trPr>
         <w:tc>
           <w:tcPr>
-            <w:tcW w:w="2298" w:type="dxa"/>
+            <w:tcW w:w="2297" w:type="dxa"/>
             <w:tcBorders/>
           </w:tcPr>
           <w:p>
@@ -13981,7 +14008,7 @@
         </w:tc>
         <w:tc>
           <w:tcPr>
-            <w:tcW w:w="2402" w:type="dxa"/>
+            <w:tcW w:w="2403" w:type="dxa"/>
             <w:tcBorders/>
           </w:tcPr>
           <w:p>
@@ -14082,7 +14109,7 @@
         </w:trPr>
         <w:tc>
           <w:tcPr>
-            <w:tcW w:w="2298" w:type="dxa"/>
+            <w:tcW w:w="2297" w:type="dxa"/>
             <w:tcBorders/>
           </w:tcPr>
           <w:p>
@@ -14114,7 +14141,7 @@
         </w:tc>
         <w:tc>
           <w:tcPr>
-            <w:tcW w:w="2402" w:type="dxa"/>
+            <w:tcW w:w="2403" w:type="dxa"/>
             <w:tcBorders/>
           </w:tcPr>
           <w:p>
@@ -14435,7 +14462,25 @@
           <w:i w:val="false"/>
           <w:sz w:val="24"/>
         </w:rPr>
-        <w:t>To build an API-independent GUI agent, for both the browser and the desktop, that finds its targets using only screenshots and the page URL and acts only through mouse and keyboard events.</w:t>
+        <w:t xml:space="preserve">To build an API-independent GUI agent, for both the browser and the desktop, that finds its targets using only screenshots and the page </w:t>
+      </w:r>
+      <w:r>
+        <w:rPr>
+          <w:rFonts w:eastAsia="Times New Roman" w:cs="Times New Roman"/>
+          <w:b w:val="false"/>
+          <w:i w:val="false"/>
+          <w:sz w:val="24"/>
+        </w:rPr>
+        <w:t>URL</w:t>
+      </w:r>
+      <w:r>
+        <w:rPr>
+          <w:rFonts w:eastAsia="Times New Roman" w:cs="Times New Roman"/>
+          <w:b w:val="false"/>
+          <w:i w:val="false"/>
+          <w:sz w:val="24"/>
+        </w:rPr>
+        <w:t>.</w:t>
       </w:r>
     </w:p>
     <w:p>
@@ -14457,7 +14502,43 @@
           <w:i w:val="false"/>
           <w:sz w:val="24"/>
         </w:rPr>
-        <w:t>To discover an application's states from its pixels, describing each screen as a set of facts tied to the section they appear in, including whether each control is available.</w:t>
+        <w:t xml:space="preserve">To discover an application's states from its pixels.  </w:t>
+      </w:r>
+      <w:r>
+        <w:rPr>
+          <w:rFonts w:eastAsia="Times New Roman" w:cs="Times New Roman"/>
+          <w:b w:val="false"/>
+          <w:i w:val="false"/>
+          <w:sz w:val="24"/>
+        </w:rPr>
+        <w:t>E</w:t>
+      </w:r>
+      <w:r>
+        <w:rPr>
+          <w:rFonts w:eastAsia="Times New Roman" w:cs="Times New Roman"/>
+          <w:b w:val="false"/>
+          <w:i w:val="false"/>
+          <w:sz w:val="24"/>
+        </w:rPr>
+        <w:t>ach screen</w:t>
+      </w:r>
+      <w:r>
+        <w:rPr>
+          <w:rFonts w:eastAsia="Times New Roman" w:cs="Times New Roman"/>
+          <w:b w:val="false"/>
+          <w:i w:val="false"/>
+          <w:sz w:val="24"/>
+        </w:rPr>
+        <w:t xml:space="preserve"> to be described</w:t>
+      </w:r>
+      <w:r>
+        <w:rPr>
+          <w:rFonts w:eastAsia="Times New Roman" w:cs="Times New Roman"/>
+          <w:b w:val="false"/>
+          <w:i w:val="false"/>
+          <w:sz w:val="24"/>
+        </w:rPr>
+        <w:t xml:space="preserve"> as a set of facts tied to the section they appear in, including whether each control is available.</w:t>
       </w:r>
     </w:p>
     <w:p>
@@ -14545,7 +14626,79 @@
           <w:i w:val="false"/>
           <w:sz w:val="24"/>
         </w:rPr>
-        <w:t>To build a benchmark containing held-out, composition, layout-shift, unavailable and unseen-application tasks, with an outcome-based scorer and a ground truth derived from perception, and to evaluate the agent on it over three seeds with suitable statistics.</w:t>
+        <w:t xml:space="preserve">To build a benchmark. </w:t>
+      </w:r>
+      <w:r>
+        <w:rPr>
+          <w:rFonts w:eastAsia="Times New Roman" w:cs="Times New Roman"/>
+          <w:b w:val="false"/>
+          <w:i w:val="false"/>
+          <w:sz w:val="24"/>
+        </w:rPr>
+        <w:t xml:space="preserve">The benchmark should </w:t>
+      </w:r>
+      <w:r>
+        <w:rPr>
+          <w:rFonts w:eastAsia="Times New Roman" w:cs="Times New Roman"/>
+          <w:b w:val="false"/>
+          <w:i w:val="false"/>
+          <w:sz w:val="24"/>
+        </w:rPr>
+        <w:t xml:space="preserve">contain </w:t>
+      </w:r>
+      <w:r>
+        <w:rPr>
+          <w:rFonts w:eastAsia="Times New Roman" w:cs="Times New Roman"/>
+          <w:b w:val="false"/>
+          <w:i w:val="false"/>
+          <w:sz w:val="24"/>
+        </w:rPr>
+        <w:t>different application tasks, like</w:t>
+      </w:r>
+      <w:r>
+        <w:rPr>
+          <w:rFonts w:eastAsia="Times New Roman" w:cs="Times New Roman"/>
+          <w:b w:val="false"/>
+          <w:i w:val="false"/>
+          <w:sz w:val="24"/>
+        </w:rPr>
+        <w:t xml:space="preserve"> held-out, composition, layout-shift, unavailable and unseen-application tasks. </w:t>
+      </w:r>
+      <w:r>
+        <w:rPr>
+          <w:rFonts w:eastAsia="Times New Roman" w:cs="Times New Roman"/>
+          <w:b w:val="false"/>
+          <w:i w:val="false"/>
+          <w:sz w:val="24"/>
+        </w:rPr>
+        <w:t>There must also be a</w:t>
+      </w:r>
+      <w:r>
+        <w:rPr>
+          <w:rFonts w:eastAsia="Times New Roman" w:cs="Times New Roman"/>
+          <w:b w:val="false"/>
+          <w:i w:val="false"/>
+          <w:sz w:val="24"/>
+        </w:rPr>
+        <w:t xml:space="preserve"> outcome-based scorer and a ground truth derived from perception. </w:t>
+      </w:r>
+      <w:r>
+        <w:rPr>
+          <w:rFonts w:eastAsia="Times New Roman" w:cs="Times New Roman"/>
+          <w:b w:val="false"/>
+          <w:i w:val="false"/>
+          <w:sz w:val="24"/>
+        </w:rPr>
+        <w:t>Aim is also</w:t>
+      </w:r>
+      <w:r>
+        <w:rPr>
+          <w:rFonts w:eastAsia="Times New Roman" w:cs="Times New Roman"/>
+          <w:b w:val="false"/>
+          <w:i w:val="false"/>
+          <w:sz w:val="24"/>
+        </w:rPr>
+        <w:t xml:space="preserve"> to evaluate the agent on it over three seeds with suitable statistics.</w:t>
       </w:r>
     </w:p>
     <w:p>
@@ -14659,7 +14812,16 @@
           <w:i w:val="false"/>
           <w:sz w:val="24"/>
         </w:rPr>
-        <w:t>The work ran in four phases, from the prototype agent loop begun on 21 August 2026 to the evaluation of 15 to 17 October (Figure 2.1 and Table 2.2). More than a third of the repository's commits are dated 15 October, the day the learned action model and the three-application lab were built.</w:t>
+        <w:t>Our work was planned to be finished in 4 different phases. T</w:t>
+      </w:r>
+      <w:r>
+        <w:rPr>
+          <w:rFonts w:eastAsia="Times New Roman" w:cs="Times New Roman"/>
+          <w:b w:val="false"/>
+          <w:i w:val="false"/>
+          <w:sz w:val="24"/>
+        </w:rPr>
+        <w:t>he prototype agent loop begun on 21 August 2026 to the evaluation of 15 to 17 October. More than a third of the repository's commits are dated 15 October, the day the learned action model and the three-application lab were built.</w:t>
       </w:r>
     </w:p>
     <w:p>
@@ -18286,8 +18448,8 @@
         <w:tblLook w:noHBand="0" w:noVBand="1" w:firstColumn="1" w:lastRow="0" w:lastColumn="0" w:firstRow="1" w:val="04a0"/>
       </w:tblPr>
       <w:tblGrid>
-        <w:gridCol w:w="2398"/>
-        <w:gridCol w:w="6702"/>
+        <w:gridCol w:w="2397"/>
+        <w:gridCol w:w="6703"/>
       </w:tblGrid>
       <w:tr>
         <w:trPr>
@@ -18296,7 +18458,7 @@
         </w:trPr>
         <w:tc>
           <w:tcPr>
-            <w:tcW w:w="2398" w:type="dxa"/>
+            <w:tcW w:w="2397" w:type="dxa"/>
             <w:tcBorders/>
             <w:shd w:color="auto" w:fill="D9D9D9" w:val="clear"/>
           </w:tcPr>
@@ -18330,7 +18492,7 @@
         </w:tc>
         <w:tc>
           <w:tcPr>
-            <w:tcW w:w="6702" w:type="dxa"/>
+            <w:tcW w:w="6703" w:type="dxa"/>
             <w:tcBorders/>
             <w:shd w:color="auto" w:fill="D9D9D9" w:val="clear"/>
           </w:tcPr>
@@ -18369,7 +18531,7 @@
         </w:trPr>
         <w:tc>
           <w:tcPr>
-            <w:tcW w:w="2398" w:type="dxa"/>
+            <w:tcW w:w="2397" w:type="dxa"/>
             <w:tcBorders/>
           </w:tcPr>
           <w:p>
@@ -18402,7 +18564,7 @@
         </w:tc>
         <w:tc>
           <w:tcPr>
-            <w:tcW w:w="6702" w:type="dxa"/>
+            <w:tcW w:w="6703" w:type="dxa"/>
             <w:tcBorders/>
           </w:tcPr>
           <w:p>
@@ -18440,7 +18602,7 @@
         </w:trPr>
         <w:tc>
           <w:tcPr>
-            <w:tcW w:w="2398" w:type="dxa"/>
+            <w:tcW w:w="2397" w:type="dxa"/>
             <w:tcBorders/>
           </w:tcPr>
           <w:p>
@@ -18473,7 +18635,7 @@
         </w:tc>
         <w:tc>
           <w:tcPr>
-            <w:tcW w:w="6702" w:type="dxa"/>
+            <w:tcW w:w="6703" w:type="dxa"/>
             <w:tcBorders/>
           </w:tcPr>
           <w:p>
@@ -18511,7 +18673,7 @@
         </w:trPr>
         <w:tc>
           <w:tcPr>
-            <w:tcW w:w="2398" w:type="dxa"/>
+            <w:tcW w:w="2397" w:type="dxa"/>
             <w:tcBorders/>
           </w:tcPr>
           <w:p>
@@ -18544,7 +18706,7 @@
         </w:tc>
         <w:tc>
           <w:tcPr>
-            <w:tcW w:w="6702" w:type="dxa"/>
+            <w:tcW w:w="6703" w:type="dxa"/>
             <w:tcBorders/>
           </w:tcPr>
           <w:p>
@@ -18582,7 +18744,7 @@
         </w:trPr>
         <w:tc>
           <w:tcPr>
-            <w:tcW w:w="2398" w:type="dxa"/>
+            <w:tcW w:w="2397" w:type="dxa"/>
             <w:tcBorders/>
           </w:tcPr>
           <w:p>
@@ -18615,7 +18777,7 @@
         </w:tc>
         <w:tc>
           <w:tcPr>
-            <w:tcW w:w="6702" w:type="dxa"/>
+            <w:tcW w:w="6703" w:type="dxa"/>
             <w:tcBorders/>
           </w:tcPr>
           <w:p>
@@ -18653,7 +18815,7 @@
         </w:trPr>
         <w:tc>
           <w:tcPr>
-            <w:tcW w:w="2398" w:type="dxa"/>
+            <w:tcW w:w="2397" w:type="dxa"/>
             <w:tcBorders/>
           </w:tcPr>
           <w:p>
@@ -18686,7 +18848,7 @@
         </w:tc>
         <w:tc>
           <w:tcPr>
-            <w:tcW w:w="6702" w:type="dxa"/>
+            <w:tcW w:w="6703" w:type="dxa"/>
             <w:tcBorders/>
           </w:tcPr>
           <w:p>
@@ -18724,7 +18886,7 @@
         </w:trPr>
         <w:tc>
           <w:tcPr>
-            <w:tcW w:w="2398" w:type="dxa"/>
+            <w:tcW w:w="2397" w:type="dxa"/>
             <w:tcBorders/>
           </w:tcPr>
           <w:p>
@@ -18756,7 +18918,7 @@
         </w:tc>
         <w:tc>
           <w:tcPr>
-            <w:tcW w:w="6702" w:type="dxa"/>
+            <w:tcW w:w="6703" w:type="dxa"/>
             <w:tcBorders/>
           </w:tcPr>
           <w:p>
@@ -18865,8 +19027,8 @@
       </w:tblPr>
       <w:tblGrid>
         <w:gridCol w:w="2900"/>
-        <w:gridCol w:w="2198"/>
-        <w:gridCol w:w="4002"/>
+        <w:gridCol w:w="2197"/>
+        <w:gridCol w:w="4003"/>
       </w:tblGrid>
       <w:tr>
         <w:trPr>
@@ -18908,7 +19070,7 @@
         </w:tc>
         <w:tc>
           <w:tcPr>
-            <w:tcW w:w="2198" w:type="dxa"/>
+            <w:tcW w:w="2197" w:type="dxa"/>
             <w:tcBorders/>
             <w:shd w:color="auto" w:fill="D9D9D9" w:val="clear"/>
           </w:tcPr>
@@ -18941,7 +19103,7 @@
         </w:tc>
         <w:tc>
           <w:tcPr>
-            <w:tcW w:w="4002" w:type="dxa"/>
+            <w:tcW w:w="4003" w:type="dxa"/>
             <w:tcBorders/>
             <w:shd w:color="auto" w:fill="D9D9D9" w:val="clear"/>
           </w:tcPr>
@@ -19011,7 +19173,7 @@
         </w:tc>
         <w:tc>
           <w:tcPr>
-            <w:tcW w:w="2198" w:type="dxa"/>
+            <w:tcW w:w="2197" w:type="dxa"/>
             <w:tcBorders/>
           </w:tcPr>
           <w:p>
@@ -19043,7 +19205,7 @@
         </w:tc>
         <w:tc>
           <w:tcPr>
-            <w:tcW w:w="4002" w:type="dxa"/>
+            <w:tcW w:w="4003" w:type="dxa"/>
             <w:tcBorders/>
           </w:tcPr>
           <w:p>
@@ -19112,7 +19274,7 @@
         </w:tc>
         <w:tc>
           <w:tcPr>
-            <w:tcW w:w="2198" w:type="dxa"/>
+            <w:tcW w:w="2197" w:type="dxa"/>
             <w:tcBorders/>
           </w:tcPr>
           <w:p>
@@ -19144,7 +19306,7 @@
         </w:tc>
         <w:tc>
           <w:tcPr>
-            <w:tcW w:w="4002" w:type="dxa"/>
+            <w:tcW w:w="4003" w:type="dxa"/>
             <w:tcBorders/>
           </w:tcPr>
           <w:p>
@@ -19213,7 +19375,7 @@
         </w:tc>
         <w:tc>
           <w:tcPr>
-            <w:tcW w:w="2198" w:type="dxa"/>
+            <w:tcW w:w="2197" w:type="dxa"/>
             <w:tcBorders/>
           </w:tcPr>
           <w:p>
@@ -19245,7 +19407,7 @@
         </w:tc>
         <w:tc>
           <w:tcPr>
-            <w:tcW w:w="4002" w:type="dxa"/>
+            <w:tcW w:w="4003" w:type="dxa"/>
             <w:tcBorders/>
           </w:tcPr>
           <w:p>
@@ -19314,7 +19476,7 @@
         </w:tc>
         <w:tc>
           <w:tcPr>
-            <w:tcW w:w="2198" w:type="dxa"/>
+            <w:tcW w:w="2197" w:type="dxa"/>
             <w:tcBorders/>
           </w:tcPr>
           <w:p>
@@ -19346,7 +19508,7 @@
         </w:tc>
         <w:tc>
           <w:tcPr>
-            <w:tcW w:w="4002" w:type="dxa"/>
+            <w:tcW w:w="4003" w:type="dxa"/>
             <w:tcBorders/>
           </w:tcPr>
           <w:p>
@@ -19415,7 +19577,7 @@
         </w:tc>
         <w:tc>
           <w:tcPr>
-            <w:tcW w:w="2198" w:type="dxa"/>
+            <w:tcW w:w="2197" w:type="dxa"/>
             <w:tcBorders/>
           </w:tcPr>
           <w:p>
@@ -19447,7 +19609,7 @@
         </w:tc>
         <w:tc>
           <w:tcPr>
-            <w:tcW w:w="4002" w:type="dxa"/>
+            <w:tcW w:w="4003" w:type="dxa"/>
             <w:tcBorders/>
           </w:tcPr>
           <w:p>
@@ -19516,7 +19678,7 @@
         </w:tc>
         <w:tc>
           <w:tcPr>
-            <w:tcW w:w="2198" w:type="dxa"/>
+            <w:tcW w:w="2197" w:type="dxa"/>
             <w:tcBorders/>
           </w:tcPr>
           <w:p>
@@ -19548,7 +19710,7 @@
         </w:tc>
         <w:tc>
           <w:tcPr>
-            <w:tcW w:w="4002" w:type="dxa"/>
+            <w:tcW w:w="4003" w:type="dxa"/>
             <w:tcBorders/>
           </w:tcPr>
           <w:p>
@@ -19617,7 +19779,7 @@
         </w:tc>
         <w:tc>
           <w:tcPr>
-            <w:tcW w:w="2198" w:type="dxa"/>
+            <w:tcW w:w="2197" w:type="dxa"/>
             <w:tcBorders/>
           </w:tcPr>
           <w:p>
@@ -19649,7 +19811,7 @@
         </w:tc>
         <w:tc>
           <w:tcPr>
-            <w:tcW w:w="4002" w:type="dxa"/>
+            <w:tcW w:w="4003" w:type="dxa"/>
             <w:tcBorders/>
           </w:tcPr>
           <w:p>
@@ -19718,7 +19880,7 @@
         </w:tc>
         <w:tc>
           <w:tcPr>
-            <w:tcW w:w="2198" w:type="dxa"/>
+            <w:tcW w:w="2197" w:type="dxa"/>
             <w:tcBorders/>
           </w:tcPr>
           <w:p>
@@ -19750,7 +19912,7 @@
         </w:tc>
         <w:tc>
           <w:tcPr>
-            <w:tcW w:w="4002" w:type="dxa"/>
+            <w:tcW w:w="4003" w:type="dxa"/>
             <w:tcBorders/>
           </w:tcPr>
           <w:p>
@@ -19819,7 +19981,7 @@
         </w:tc>
         <w:tc>
           <w:tcPr>
-            <w:tcW w:w="2198" w:type="dxa"/>
+            <w:tcW w:w="2197" w:type="dxa"/>
             <w:tcBorders/>
           </w:tcPr>
           <w:p>
@@ -19851,7 +20013,7 @@
         </w:tc>
         <w:tc>
           <w:tcPr>
-            <w:tcW w:w="4002" w:type="dxa"/>
+            <w:tcW w:w="4003" w:type="dxa"/>
             <w:tcBorders/>
           </w:tcPr>
           <w:p>
@@ -19920,7 +20082,7 @@
         </w:tc>
         <w:tc>
           <w:tcPr>
-            <w:tcW w:w="2198" w:type="dxa"/>
+            <w:tcW w:w="2197" w:type="dxa"/>
             <w:tcBorders/>
           </w:tcPr>
           <w:p>
@@ -19952,7 +20114,7 @@
         </w:tc>
         <w:tc>
           <w:tcPr>
-            <w:tcW w:w="4002" w:type="dxa"/>
+            <w:tcW w:w="4003" w:type="dxa"/>
             <w:tcBorders/>
           </w:tcPr>
           <w:p>
@@ -20021,7 +20183,7 @@
         </w:tc>
         <w:tc>
           <w:tcPr>
-            <w:tcW w:w="2198" w:type="dxa"/>
+            <w:tcW w:w="2197" w:type="dxa"/>
             <w:tcBorders/>
           </w:tcPr>
           <w:p>
@@ -20053,7 +20215,7 @@
         </w:tc>
         <w:tc>
           <w:tcPr>
-            <w:tcW w:w="4002" w:type="dxa"/>
+            <w:tcW w:w="4003" w:type="dxa"/>
             <w:tcBorders/>
           </w:tcPr>
           <w:p>
@@ -20122,7 +20284,7 @@
         </w:tc>
         <w:tc>
           <w:tcPr>
-            <w:tcW w:w="2198" w:type="dxa"/>
+            <w:tcW w:w="2197" w:type="dxa"/>
             <w:tcBorders/>
           </w:tcPr>
           <w:p>
@@ -20154,7 +20316,7 @@
         </w:tc>
         <w:tc>
           <w:tcPr>
-            <w:tcW w:w="4002" w:type="dxa"/>
+            <w:tcW w:w="4003" w:type="dxa"/>
             <w:tcBorders/>
           </w:tcPr>
           <w:p>
@@ -21348,8 +21510,8 @@
         <w:tblLook w:noHBand="0" w:noVBand="1" w:firstColumn="1" w:lastRow="0" w:lastColumn="0" w:firstRow="1" w:val="04a0"/>
       </w:tblPr>
       <w:tblGrid>
-        <w:gridCol w:w="1498"/>
-        <w:gridCol w:w="3302"/>
+        <w:gridCol w:w="1497"/>
+        <w:gridCol w:w="3303"/>
         <w:gridCol w:w="4300"/>
       </w:tblGrid>
       <w:tr>
@@ -21359,7 +21521,7 @@
         </w:trPr>
         <w:tc>
           <w:tcPr>
-            <w:tcW w:w="1498" w:type="dxa"/>
+            <w:tcW w:w="1497" w:type="dxa"/>
             <w:tcBorders/>
             <w:shd w:color="auto" w:fill="D9D9D9" w:val="clear"/>
           </w:tcPr>
@@ -21393,7 +21555,7 @@
         </w:tc>
         <w:tc>
           <w:tcPr>
-            <w:tcW w:w="3302" w:type="dxa"/>
+            <w:tcW w:w="3303" w:type="dxa"/>
             <w:tcBorders/>
             <w:shd w:color="auto" w:fill="D9D9D9" w:val="clear"/>
           </w:tcPr>
@@ -21466,7 +21628,7 @@
         </w:trPr>
         <w:tc>
           <w:tcPr>
-            <w:tcW w:w="1498" w:type="dxa"/>
+            <w:tcW w:w="1497" w:type="dxa"/>
             <w:tcBorders/>
           </w:tcPr>
           <w:p>
@@ -21499,7 +21661,7 @@
         </w:tc>
         <w:tc>
           <w:tcPr>
-            <w:tcW w:w="3302" w:type="dxa"/>
+            <w:tcW w:w="3303" w:type="dxa"/>
             <w:tcBorders/>
           </w:tcPr>
           <w:p>
@@ -21570,7 +21732,7 @@
         </w:trPr>
         <w:tc>
           <w:tcPr>
-            <w:tcW w:w="1498" w:type="dxa"/>
+            <w:tcW w:w="1497" w:type="dxa"/>
             <w:tcBorders/>
           </w:tcPr>
           <w:p>
@@ -21603,7 +21765,7 @@
         </w:tc>
         <w:tc>
           <w:tcPr>
-            <w:tcW w:w="3302" w:type="dxa"/>
+            <w:tcW w:w="3303" w:type="dxa"/>
             <w:tcBorders/>
           </w:tcPr>
           <w:p>
@@ -21674,7 +21836,7 @@
         </w:trPr>
         <w:tc>
           <w:tcPr>
-            <w:tcW w:w="1498" w:type="dxa"/>
+            <w:tcW w:w="1497" w:type="dxa"/>
             <w:tcBorders/>
           </w:tcPr>
           <w:p>
@@ -21707,7 +21869,7 @@
         </w:tc>
         <w:tc>
           <w:tcPr>
-            <w:tcW w:w="3302" w:type="dxa"/>
+            <w:tcW w:w="3303" w:type="dxa"/>
             <w:tcBorders/>
           </w:tcPr>
           <w:p>
@@ -21778,7 +21940,7 @@
         </w:trPr>
         <w:tc>
           <w:tcPr>
-            <w:tcW w:w="1498" w:type="dxa"/>
+            <w:tcW w:w="1497" w:type="dxa"/>
             <w:tcBorders/>
           </w:tcPr>
           <w:p>
@@ -21810,7 +21972,7 @@
         </w:tc>
         <w:tc>
           <w:tcPr>
-            <w:tcW w:w="3302" w:type="dxa"/>
+            <w:tcW w:w="3303" w:type="dxa"/>
             <w:tcBorders/>
           </w:tcPr>
           <w:p>
@@ -22417,8 +22579,8 @@
         <w:tblLook w:noHBand="0" w:noVBand="1" w:firstColumn="1" w:lastRow="0" w:lastColumn="0" w:firstRow="1" w:val="04a0"/>
       </w:tblPr>
       <w:tblGrid>
-        <w:gridCol w:w="698"/>
-        <w:gridCol w:w="2302"/>
+        <w:gridCol w:w="697"/>
+        <w:gridCol w:w="2303"/>
         <w:gridCol w:w="1000"/>
         <w:gridCol w:w="3199"/>
         <w:gridCol w:w="1901"/>
@@ -22430,7 +22592,7 @@
         </w:trPr>
         <w:tc>
           <w:tcPr>
-            <w:tcW w:w="698" w:type="dxa"/>
+            <w:tcW w:w="697" w:type="dxa"/>
             <w:tcBorders/>
             <w:shd w:color="auto" w:fill="D9D9D9" w:val="clear"/>
           </w:tcPr>
@@ -22464,7 +22626,7 @@
         </w:tc>
         <w:tc>
           <w:tcPr>
-            <w:tcW w:w="2302" w:type="dxa"/>
+            <w:tcW w:w="2303" w:type="dxa"/>
             <w:tcBorders/>
             <w:shd w:color="auto" w:fill="D9D9D9" w:val="clear"/>
           </w:tcPr>
@@ -22605,7 +22767,7 @@
         </w:trPr>
         <w:tc>
           <w:tcPr>
-            <w:tcW w:w="698" w:type="dxa"/>
+            <w:tcW w:w="697" w:type="dxa"/>
             <w:tcBorders/>
           </w:tcPr>
           <w:p>
@@ -22638,7 +22800,7 @@
         </w:tc>
         <w:tc>
           <w:tcPr>
-            <w:tcW w:w="2302" w:type="dxa"/>
+            <w:tcW w:w="2303" w:type="dxa"/>
             <w:tcBorders/>
           </w:tcPr>
           <w:p>
@@ -22775,7 +22937,7 @@
         </w:trPr>
         <w:tc>
           <w:tcPr>
-            <w:tcW w:w="698" w:type="dxa"/>
+            <w:tcW w:w="697" w:type="dxa"/>
             <w:tcBorders/>
           </w:tcPr>
           <w:p>
@@ -22808,7 +22970,7 @@
         </w:tc>
         <w:tc>
           <w:tcPr>
-            <w:tcW w:w="2302" w:type="dxa"/>
+            <w:tcW w:w="2303" w:type="dxa"/>
             <w:tcBorders/>
           </w:tcPr>
           <w:p>
@@ -22945,7 +23107,7 @@
         </w:trPr>
         <w:tc>
           <w:tcPr>
-            <w:tcW w:w="698" w:type="dxa"/>
+            <w:tcW w:w="697" w:type="dxa"/>
             <w:tcBorders/>
           </w:tcPr>
           <w:p>
@@ -22977,7 +23139,7 @@
         </w:tc>
         <w:tc>
           <w:tcPr>
-            <w:tcW w:w="2302" w:type="dxa"/>
+            <w:tcW w:w="2303" w:type="dxa"/>
             <w:tcBorders/>
           </w:tcPr>
           <w:p>
@@ -23193,8 +23355,8 @@
       </w:tblPr>
       <w:tblGrid>
         <w:gridCol w:w="1698"/>
-        <w:gridCol w:w="800"/>
-        <w:gridCol w:w="5601"/>
+        <w:gridCol w:w="799"/>
+        <w:gridCol w:w="5602"/>
         <w:gridCol w:w="1001"/>
       </w:tblGrid>
       <w:tr>
@@ -23238,7 +23400,7 @@
         </w:tc>
         <w:tc>
           <w:tcPr>
-            <w:tcW w:w="800" w:type="dxa"/>
+            <w:tcW w:w="799" w:type="dxa"/>
             <w:tcBorders/>
             <w:shd w:color="auto" w:fill="D9D9D9" w:val="clear"/>
           </w:tcPr>
@@ -23272,7 +23434,7 @@
         </w:tc>
         <w:tc>
           <w:tcPr>
-            <w:tcW w:w="5601" w:type="dxa"/>
+            <w:tcW w:w="5602" w:type="dxa"/>
             <w:tcBorders/>
             <w:shd w:color="auto" w:fill="D9D9D9" w:val="clear"/>
           </w:tcPr>
@@ -23378,7 +23540,7 @@
         </w:tc>
         <w:tc>
           <w:tcPr>
-            <w:tcW w:w="800" w:type="dxa"/>
+            <w:tcW w:w="799" w:type="dxa"/>
             <w:tcBorders/>
           </w:tcPr>
           <w:p>
@@ -23411,7 +23573,7 @@
         </w:tc>
         <w:tc>
           <w:tcPr>
-            <w:tcW w:w="5601" w:type="dxa"/>
+            <w:tcW w:w="5602" w:type="dxa"/>
             <w:tcBorders/>
           </w:tcPr>
           <w:p>
@@ -23515,7 +23677,7 @@
         </w:tc>
         <w:tc>
           <w:tcPr>
-            <w:tcW w:w="800" w:type="dxa"/>
+            <w:tcW w:w="799" w:type="dxa"/>
             <w:tcBorders/>
           </w:tcPr>
           <w:p>
@@ -23548,7 +23710,7 @@
         </w:tc>
         <w:tc>
           <w:tcPr>
-            <w:tcW w:w="5601" w:type="dxa"/>
+            <w:tcW w:w="5602" w:type="dxa"/>
             <w:tcBorders/>
           </w:tcPr>
           <w:p>
@@ -23652,7 +23814,7 @@
         </w:tc>
         <w:tc>
           <w:tcPr>
-            <w:tcW w:w="800" w:type="dxa"/>
+            <w:tcW w:w="799" w:type="dxa"/>
             <w:tcBorders/>
           </w:tcPr>
           <w:p>
@@ -23685,7 +23847,7 @@
         </w:tc>
         <w:tc>
           <w:tcPr>
-            <w:tcW w:w="5601" w:type="dxa"/>
+            <w:tcW w:w="5602" w:type="dxa"/>
             <w:tcBorders/>
           </w:tcPr>
           <w:p>
@@ -23789,7 +23951,7 @@
         </w:tc>
         <w:tc>
           <w:tcPr>
-            <w:tcW w:w="800" w:type="dxa"/>
+            <w:tcW w:w="799" w:type="dxa"/>
             <w:tcBorders/>
           </w:tcPr>
           <w:p>
@@ -23822,7 +23984,7 @@
         </w:tc>
         <w:tc>
           <w:tcPr>
-            <w:tcW w:w="5601" w:type="dxa"/>
+            <w:tcW w:w="5602" w:type="dxa"/>
             <w:tcBorders/>
           </w:tcPr>
           <w:p>
@@ -23926,7 +24088,7 @@
         </w:tc>
         <w:tc>
           <w:tcPr>
-            <w:tcW w:w="800" w:type="dxa"/>
+            <w:tcW w:w="799" w:type="dxa"/>
             <w:tcBorders/>
           </w:tcPr>
           <w:p>
@@ -23959,7 +24121,7 @@
         </w:tc>
         <w:tc>
           <w:tcPr>
-            <w:tcW w:w="5601" w:type="dxa"/>
+            <w:tcW w:w="5602" w:type="dxa"/>
             <w:tcBorders/>
           </w:tcPr>
           <w:p>
@@ -24062,7 +24224,7 @@
         </w:tc>
         <w:tc>
           <w:tcPr>
-            <w:tcW w:w="800" w:type="dxa"/>
+            <w:tcW w:w="799" w:type="dxa"/>
             <w:tcBorders/>
           </w:tcPr>
           <w:p>
@@ -24094,7 +24256,7 @@
         </w:tc>
         <w:tc>
           <w:tcPr>
-            <w:tcW w:w="5601" w:type="dxa"/>
+            <w:tcW w:w="5602" w:type="dxa"/>
             <w:tcBorders/>
           </w:tcPr>
           <w:p>
@@ -27069,8 +27231,8 @@
       </w:tblPr>
       <w:tblGrid>
         <w:gridCol w:w="798"/>
-        <w:gridCol w:w="2400"/>
-        <w:gridCol w:w="4901"/>
+        <w:gridCol w:w="2399"/>
+        <w:gridCol w:w="4902"/>
         <w:gridCol w:w="1001"/>
       </w:tblGrid>
       <w:tr>
@@ -27114,7 +27276,7 @@
         </w:tc>
         <w:tc>
           <w:tcPr>
-            <w:tcW w:w="2400" w:type="dxa"/>
+            <w:tcW w:w="2399" w:type="dxa"/>
             <w:tcBorders/>
             <w:shd w:color="auto" w:fill="D9D9D9" w:val="clear"/>
           </w:tcPr>
@@ -27148,7 +27310,7 @@
         </w:tc>
         <w:tc>
           <w:tcPr>
-            <w:tcW w:w="4901" w:type="dxa"/>
+            <w:tcW w:w="4902" w:type="dxa"/>
             <w:tcBorders/>
             <w:shd w:color="auto" w:fill="D9D9D9" w:val="clear"/>
           </w:tcPr>
@@ -27254,7 +27416,7 @@
         </w:tc>
         <w:tc>
           <w:tcPr>
-            <w:tcW w:w="2400" w:type="dxa"/>
+            <w:tcW w:w="2399" w:type="dxa"/>
             <w:tcBorders/>
           </w:tcPr>
           <w:p>
@@ -27287,7 +27449,7 @@
         </w:tc>
         <w:tc>
           <w:tcPr>
-            <w:tcW w:w="4901" w:type="dxa"/>
+            <w:tcW w:w="4902" w:type="dxa"/>
             <w:tcBorders/>
           </w:tcPr>
           <w:p>
@@ -27391,7 +27553,7 @@
         </w:tc>
         <w:tc>
           <w:tcPr>
-            <w:tcW w:w="2400" w:type="dxa"/>
+            <w:tcW w:w="2399" w:type="dxa"/>
             <w:tcBorders/>
           </w:tcPr>
           <w:p>
@@ -27424,7 +27586,7 @@
         </w:tc>
         <w:tc>
           <w:tcPr>
-            <w:tcW w:w="4901" w:type="dxa"/>
+            <w:tcW w:w="4902" w:type="dxa"/>
             <w:tcBorders/>
           </w:tcPr>
           <w:p>
@@ -27528,7 +27690,7 @@
         </w:tc>
         <w:tc>
           <w:tcPr>
-            <w:tcW w:w="2400" w:type="dxa"/>
+            <w:tcW w:w="2399" w:type="dxa"/>
             <w:tcBorders/>
           </w:tcPr>
           <w:p>
@@ -27561,7 +27723,7 @@
         </w:tc>
         <w:tc>
           <w:tcPr>
-            <w:tcW w:w="4901" w:type="dxa"/>
+            <w:tcW w:w="4902" w:type="dxa"/>
             <w:tcBorders/>
           </w:tcPr>
           <w:p>
@@ -27665,7 +27827,7 @@
         </w:tc>
         <w:tc>
           <w:tcPr>
-            <w:tcW w:w="2400" w:type="dxa"/>
+            <w:tcW w:w="2399" w:type="dxa"/>
             <w:tcBorders/>
           </w:tcPr>
           <w:p>
@@ -27698,7 +27860,7 @@
         </w:tc>
         <w:tc>
           <w:tcPr>
-            <w:tcW w:w="4901" w:type="dxa"/>
+            <w:tcW w:w="4902" w:type="dxa"/>
             <w:tcBorders/>
           </w:tcPr>
           <w:p>
@@ -27802,7 +27964,7 @@
         </w:tc>
         <w:tc>
           <w:tcPr>
-            <w:tcW w:w="2400" w:type="dxa"/>
+            <w:tcW w:w="2399" w:type="dxa"/>
             <w:tcBorders/>
           </w:tcPr>
           <w:p>
@@ -27835,7 +27997,7 @@
         </w:tc>
         <w:tc>
           <w:tcPr>
-            <w:tcW w:w="4901" w:type="dxa"/>
+            <w:tcW w:w="4902" w:type="dxa"/>
             <w:tcBorders/>
           </w:tcPr>
           <w:p>
@@ -27939,7 +28101,7 @@
         </w:tc>
         <w:tc>
           <w:tcPr>
-            <w:tcW w:w="2400" w:type="dxa"/>
+            <w:tcW w:w="2399" w:type="dxa"/>
             <w:tcBorders/>
           </w:tcPr>
           <w:p>
@@ -27972,7 +28134,7 @@
         </w:tc>
         <w:tc>
           <w:tcPr>
-            <w:tcW w:w="4901" w:type="dxa"/>
+            <w:tcW w:w="4902" w:type="dxa"/>
             <w:tcBorders/>
           </w:tcPr>
           <w:p>
@@ -28076,7 +28238,7 @@
         </w:tc>
         <w:tc>
           <w:tcPr>
-            <w:tcW w:w="2400" w:type="dxa"/>
+            <w:tcW w:w="2399" w:type="dxa"/>
             <w:tcBorders/>
           </w:tcPr>
           <w:p>
@@ -28109,7 +28271,7 @@
         </w:tc>
         <w:tc>
           <w:tcPr>
-            <w:tcW w:w="4901" w:type="dxa"/>
+            <w:tcW w:w="4902" w:type="dxa"/>
             <w:tcBorders/>
           </w:tcPr>
           <w:p>
@@ -28212,7 +28374,7 @@
         </w:tc>
         <w:tc>
           <w:tcPr>
-            <w:tcW w:w="2400" w:type="dxa"/>
+            <w:tcW w:w="2399" w:type="dxa"/>
             <w:tcBorders/>
           </w:tcPr>
           <w:p>
@@ -28244,7 +28406,7 @@
         </w:tc>
         <w:tc>
           <w:tcPr>
-            <w:tcW w:w="4901" w:type="dxa"/>
+            <w:tcW w:w="4902" w:type="dxa"/>
             <w:tcBorders/>
           </w:tcPr>
           <w:p>
@@ -28825,10 +28987,10 @@
       </w:tblPr>
       <w:tblGrid>
         <w:gridCol w:w="1898"/>
-        <w:gridCol w:w="750"/>
-        <w:gridCol w:w="802"/>
-        <w:gridCol w:w="648"/>
-        <w:gridCol w:w="802"/>
+        <w:gridCol w:w="749"/>
+        <w:gridCol w:w="803"/>
+        <w:gridCol w:w="647"/>
+        <w:gridCol w:w="803"/>
         <w:gridCol w:w="800"/>
         <w:gridCol w:w="650"/>
         <w:gridCol w:w="800"/>
@@ -28876,7 +29038,7 @@
         </w:tc>
         <w:tc>
           <w:tcPr>
-            <w:tcW w:w="750" w:type="dxa"/>
+            <w:tcW w:w="749" w:type="dxa"/>
             <w:tcBorders/>
             <w:shd w:color="auto" w:fill="D9D9D9" w:val="clear"/>
           </w:tcPr>
@@ -28910,7 +29072,7 @@
         </w:tc>
         <w:tc>
           <w:tcPr>
-            <w:tcW w:w="802" w:type="dxa"/>
+            <w:tcW w:w="803" w:type="dxa"/>
             <w:tcBorders/>
             <w:shd w:color="auto" w:fill="D9D9D9" w:val="clear"/>
           </w:tcPr>
@@ -28944,7 +29106,7 @@
         </w:tc>
         <w:tc>
           <w:tcPr>
-            <w:tcW w:w="648" w:type="dxa"/>
+            <w:tcW w:w="647" w:type="dxa"/>
             <w:tcBorders/>
             <w:shd w:color="auto" w:fill="D9D9D9" w:val="clear"/>
           </w:tcPr>
@@ -28978,7 +29140,7 @@
         </w:tc>
         <w:tc>
           <w:tcPr>
-            <w:tcW w:w="802" w:type="dxa"/>
+            <w:tcW w:w="803" w:type="dxa"/>
             <w:tcBorders/>
             <w:shd w:color="auto" w:fill="D9D9D9" w:val="clear"/>
           </w:tcPr>
@@ -29220,7 +29382,7 @@
         </w:tc>
         <w:tc>
           <w:tcPr>
-            <w:tcW w:w="750" w:type="dxa"/>
+            <w:tcW w:w="749" w:type="dxa"/>
             <w:tcBorders/>
           </w:tcPr>
           <w:p>
@@ -29253,7 +29415,7 @@
         </w:tc>
         <w:tc>
           <w:tcPr>
-            <w:tcW w:w="802" w:type="dxa"/>
+            <w:tcW w:w="803" w:type="dxa"/>
             <w:tcBorders/>
           </w:tcPr>
           <w:p>
@@ -29286,7 +29448,7 @@
         </w:tc>
         <w:tc>
           <w:tcPr>
-            <w:tcW w:w="648" w:type="dxa"/>
+            <w:tcW w:w="647" w:type="dxa"/>
             <w:tcBorders/>
           </w:tcPr>
           <w:p>
@@ -29319,7 +29481,7 @@
         </w:tc>
         <w:tc>
           <w:tcPr>
-            <w:tcW w:w="802" w:type="dxa"/>
+            <w:tcW w:w="803" w:type="dxa"/>
             <w:tcBorders/>
           </w:tcPr>
           <w:p>
@@ -29555,7 +29717,7 @@
         </w:tc>
         <w:tc>
           <w:tcPr>
-            <w:tcW w:w="750" w:type="dxa"/>
+            <w:tcW w:w="749" w:type="dxa"/>
             <w:tcBorders/>
           </w:tcPr>
           <w:p>
@@ -29588,7 +29750,7 @@
         </w:tc>
         <w:tc>
           <w:tcPr>
-            <w:tcW w:w="802" w:type="dxa"/>
+            <w:tcW w:w="803" w:type="dxa"/>
             <w:tcBorders/>
           </w:tcPr>
           <w:p>
@@ -29621,7 +29783,7 @@
         </w:tc>
         <w:tc>
           <w:tcPr>
-            <w:tcW w:w="648" w:type="dxa"/>
+            <w:tcW w:w="647" w:type="dxa"/>
             <w:tcBorders/>
           </w:tcPr>
           <w:p>
@@ -29654,7 +29816,7 @@
         </w:tc>
         <w:tc>
           <w:tcPr>
-            <w:tcW w:w="802" w:type="dxa"/>
+            <w:tcW w:w="803" w:type="dxa"/>
             <w:tcBorders/>
           </w:tcPr>
           <w:p>
@@ -29890,7 +30052,7 @@
         </w:tc>
         <w:tc>
           <w:tcPr>
-            <w:tcW w:w="750" w:type="dxa"/>
+            <w:tcW w:w="749" w:type="dxa"/>
             <w:tcBorders/>
           </w:tcPr>
           <w:p>
@@ -29923,7 +30085,7 @@
         </w:tc>
         <w:tc>
           <w:tcPr>
-            <w:tcW w:w="802" w:type="dxa"/>
+            <w:tcW w:w="803" w:type="dxa"/>
             <w:tcBorders/>
           </w:tcPr>
           <w:p>
@@ -29956,7 +30118,7 @@
         </w:tc>
         <w:tc>
           <w:tcPr>
-            <w:tcW w:w="648" w:type="dxa"/>
+            <w:tcW w:w="647" w:type="dxa"/>
             <w:tcBorders/>
           </w:tcPr>
           <w:p>
@@ -29989,7 +30151,7 @@
         </w:tc>
         <w:tc>
           <w:tcPr>
-            <w:tcW w:w="802" w:type="dxa"/>
+            <w:tcW w:w="803" w:type="dxa"/>
             <w:tcBorders/>
           </w:tcPr>
           <w:p>
@@ -30225,7 +30387,7 @@
         </w:tc>
         <w:tc>
           <w:tcPr>
-            <w:tcW w:w="750" w:type="dxa"/>
+            <w:tcW w:w="749" w:type="dxa"/>
             <w:tcBorders/>
           </w:tcPr>
           <w:p>
@@ -30258,7 +30420,7 @@
         </w:tc>
         <w:tc>
           <w:tcPr>
-            <w:tcW w:w="802" w:type="dxa"/>
+            <w:tcW w:w="803" w:type="dxa"/>
             <w:tcBorders/>
           </w:tcPr>
           <w:p>
@@ -30291,7 +30453,7 @@
         </w:tc>
         <w:tc>
           <w:tcPr>
-            <w:tcW w:w="648" w:type="dxa"/>
+            <w:tcW w:w="647" w:type="dxa"/>
             <w:tcBorders/>
           </w:tcPr>
           <w:p>
@@ -30324,7 +30486,7 @@
         </w:tc>
         <w:tc>
           <w:tcPr>
-            <w:tcW w:w="802" w:type="dxa"/>
+            <w:tcW w:w="803" w:type="dxa"/>
             <w:tcBorders/>
           </w:tcPr>
           <w:p>
@@ -30560,7 +30722,7 @@
         </w:tc>
         <w:tc>
           <w:tcPr>
-            <w:tcW w:w="750" w:type="dxa"/>
+            <w:tcW w:w="749" w:type="dxa"/>
             <w:tcBorders/>
           </w:tcPr>
           <w:p>
@@ -30593,7 +30755,7 @@
         </w:tc>
         <w:tc>
           <w:tcPr>
-            <w:tcW w:w="802" w:type="dxa"/>
+            <w:tcW w:w="803" w:type="dxa"/>
             <w:tcBorders/>
           </w:tcPr>
           <w:p>
@@ -30626,7 +30788,7 @@
         </w:tc>
         <w:tc>
           <w:tcPr>
-            <w:tcW w:w="648" w:type="dxa"/>
+            <w:tcW w:w="647" w:type="dxa"/>
             <w:tcBorders/>
           </w:tcPr>
           <w:p>
@@ -30659,7 +30821,7 @@
         </w:tc>
         <w:tc>
           <w:tcPr>
-            <w:tcW w:w="802" w:type="dxa"/>
+            <w:tcW w:w="803" w:type="dxa"/>
             <w:tcBorders/>
           </w:tcPr>
           <w:p>
@@ -30895,7 +31057,7 @@
         </w:tc>
         <w:tc>
           <w:tcPr>
-            <w:tcW w:w="750" w:type="dxa"/>
+            <w:tcW w:w="749" w:type="dxa"/>
             <w:tcBorders/>
           </w:tcPr>
           <w:p>
@@ -30928,7 +31090,7 @@
         </w:tc>
         <w:tc>
           <w:tcPr>
-            <w:tcW w:w="802" w:type="dxa"/>
+            <w:tcW w:w="803" w:type="dxa"/>
             <w:tcBorders/>
           </w:tcPr>
           <w:p>
@@ -30961,7 +31123,7 @@
         </w:tc>
         <w:tc>
           <w:tcPr>
-            <w:tcW w:w="648" w:type="dxa"/>
+            <w:tcW w:w="647" w:type="dxa"/>
             <w:tcBorders/>
           </w:tcPr>
           <w:p>
@@ -30994,7 +31156,7 @@
         </w:tc>
         <w:tc>
           <w:tcPr>
-            <w:tcW w:w="802" w:type="dxa"/>
+            <w:tcW w:w="803" w:type="dxa"/>
             <w:tcBorders/>
           </w:tcPr>
           <w:p>
@@ -31229,7 +31391,7 @@
         </w:tc>
         <w:tc>
           <w:tcPr>
-            <w:tcW w:w="750" w:type="dxa"/>
+            <w:tcW w:w="749" w:type="dxa"/>
             <w:tcBorders/>
           </w:tcPr>
           <w:p>
@@ -31261,7 +31423,7 @@
         </w:tc>
         <w:tc>
           <w:tcPr>
-            <w:tcW w:w="802" w:type="dxa"/>
+            <w:tcW w:w="803" w:type="dxa"/>
             <w:tcBorders/>
           </w:tcPr>
           <w:p>
@@ -31293,7 +31455,7 @@
         </w:tc>
         <w:tc>
           <w:tcPr>
-            <w:tcW w:w="648" w:type="dxa"/>
+            <w:tcW w:w="647" w:type="dxa"/>
             <w:tcBorders/>
           </w:tcPr>
           <w:p>
@@ -31325,7 +31487,7 @@
         </w:tc>
         <w:tc>
           <w:tcPr>
-            <w:tcW w:w="802" w:type="dxa"/>
+            <w:tcW w:w="803" w:type="dxa"/>
             <w:tcBorders/>
           </w:tcPr>
           <w:p>
@@ -31739,13 +31901,13 @@
         <w:gridCol w:w="1299"/>
         <w:gridCol w:w="801"/>
         <w:gridCol w:w="798"/>
+        <w:gridCol w:w="899"/>
+        <w:gridCol w:w="903"/>
         <w:gridCol w:w="900"/>
-        <w:gridCol w:w="902"/>
-        <w:gridCol w:w="900"/>
-        <w:gridCol w:w="898"/>
-        <w:gridCol w:w="802"/>
-        <w:gridCol w:w="798"/>
-        <w:gridCol w:w="1102"/>
+        <w:gridCol w:w="897"/>
+        <w:gridCol w:w="803"/>
+        <w:gridCol w:w="797"/>
+        <w:gridCol w:w="1103"/>
       </w:tblGrid>
       <w:tr>
         <w:trPr>
@@ -31856,6 +32018,74 @@
         </w:tc>
         <w:tc>
           <w:tcPr>
+            <w:tcW w:w="899" w:type="dxa"/>
+            <w:tcBorders/>
+            <w:shd w:color="auto" w:fill="D9D9D9" w:val="clear"/>
+          </w:tcPr>
+          <w:p>
+            <w:pPr>
+              <w:pStyle w:val="Normal"/>
+              <w:keepNext w:val="true"/>
+              <w:suppressAutoHyphens w:val="true"/>
+              <w:spacing w:lineRule="auto" w:line="240" w:before="20" w:after="20"/>
+              <w:jc w:val="start"/>
+              <w:rPr>
+                <w:kern w:val="0"/>
+                <w:sz w:val="22"/>
+                <w:szCs w:val="22"/>
+                <w:lang w:eastAsia="en-US" w:bidi="ar-SA"/>
+              </w:rPr>
+            </w:pPr>
+            <w:r>
+              <w:rPr>
+                <w:rFonts w:eastAsia="Times New Roman" w:cs="Times New Roman"/>
+                <w:b/>
+                <w:i w:val="false"/>
+                <w:kern w:val="0"/>
+                <w:sz w:val="18"/>
+                <w:szCs w:val="22"/>
+                <w:lang w:eastAsia="en-US" w:bidi="ar-SA"/>
+              </w:rPr>
+              <w:t>Cand. P</w:t>
+            </w:r>
+          </w:p>
+        </w:tc>
+        <w:tc>
+          <w:tcPr>
+            <w:tcW w:w="903" w:type="dxa"/>
+            <w:tcBorders/>
+            <w:shd w:color="auto" w:fill="D9D9D9" w:val="clear"/>
+          </w:tcPr>
+          <w:p>
+            <w:pPr>
+              <w:pStyle w:val="Normal"/>
+              <w:keepNext w:val="true"/>
+              <w:suppressAutoHyphens w:val="true"/>
+              <w:spacing w:lineRule="auto" w:line="240" w:before="20" w:after="20"/>
+              <w:jc w:val="start"/>
+              <w:rPr>
+                <w:kern w:val="0"/>
+                <w:sz w:val="22"/>
+                <w:szCs w:val="22"/>
+                <w:lang w:eastAsia="en-US" w:bidi="ar-SA"/>
+              </w:rPr>
+            </w:pPr>
+            <w:r>
+              <w:rPr>
+                <w:rFonts w:eastAsia="Times New Roman" w:cs="Times New Roman"/>
+                <w:b/>
+                <w:i w:val="false"/>
+                <w:kern w:val="0"/>
+                <w:sz w:val="18"/>
+                <w:szCs w:val="22"/>
+                <w:lang w:eastAsia="en-US" w:bidi="ar-SA"/>
+              </w:rPr>
+              <w:t>Cand. R</w:t>
+            </w:r>
+          </w:p>
+        </w:tc>
+        <w:tc>
+          <w:tcPr>
             <w:tcW w:w="900" w:type="dxa"/>
             <w:tcBorders/>
             <w:shd w:color="auto" w:fill="D9D9D9" w:val="clear"/>
@@ -31884,13 +32114,13 @@
                 <w:szCs w:val="22"/>
                 <w:lang w:eastAsia="en-US" w:bidi="ar-SA"/>
               </w:rPr>
-              <w:t>Cand. P</w:t>
-            </w:r>
-          </w:p>
-        </w:tc>
-        <w:tc>
-          <w:tcPr>
-            <w:tcW w:w="902" w:type="dxa"/>
+              <w:t>Conf. P</w:t>
+            </w:r>
+          </w:p>
+        </w:tc>
+        <w:tc>
+          <w:tcPr>
+            <w:tcW w:w="897" w:type="dxa"/>
             <w:tcBorders/>
             <w:shd w:color="auto" w:fill="D9D9D9" w:val="clear"/>
           </w:tcPr>
@@ -31918,13 +32148,13 @@
                 <w:szCs w:val="22"/>
                 <w:lang w:eastAsia="en-US" w:bidi="ar-SA"/>
               </w:rPr>
-              <w:t>Cand. R</w:t>
-            </w:r>
-          </w:p>
-        </w:tc>
-        <w:tc>
-          <w:tcPr>
-            <w:tcW w:w="900" w:type="dxa"/>
+              <w:t>Conf. R</w:t>
+            </w:r>
+          </w:p>
+        </w:tc>
+        <w:tc>
+          <w:tcPr>
+            <w:tcW w:w="803" w:type="dxa"/>
             <w:tcBorders/>
             <w:shd w:color="auto" w:fill="D9D9D9" w:val="clear"/>
           </w:tcPr>
@@ -31952,13 +32182,13 @@
                 <w:szCs w:val="22"/>
                 <w:lang w:eastAsia="en-US" w:bidi="ar-SA"/>
               </w:rPr>
-              <w:t>Conf. P</w:t>
-            </w:r>
-          </w:p>
-        </w:tc>
-        <w:tc>
-          <w:tcPr>
-            <w:tcW w:w="898" w:type="dxa"/>
+              <w:t>Ctx. P</w:t>
+            </w:r>
+          </w:p>
+        </w:tc>
+        <w:tc>
+          <w:tcPr>
+            <w:tcW w:w="797" w:type="dxa"/>
             <w:tcBorders/>
             <w:shd w:color="auto" w:fill="D9D9D9" w:val="clear"/>
           </w:tcPr>
@@ -31986,81 +32216,13 @@
                 <w:szCs w:val="22"/>
                 <w:lang w:eastAsia="en-US" w:bidi="ar-SA"/>
               </w:rPr>
-              <w:t>Conf. R</w:t>
-            </w:r>
-          </w:p>
-        </w:tc>
-        <w:tc>
-          <w:tcPr>
-            <w:tcW w:w="802" w:type="dxa"/>
-            <w:tcBorders/>
-            <w:shd w:color="auto" w:fill="D9D9D9" w:val="clear"/>
-          </w:tcPr>
-          <w:p>
-            <w:pPr>
-              <w:pStyle w:val="Normal"/>
-              <w:keepNext w:val="true"/>
-              <w:suppressAutoHyphens w:val="true"/>
-              <w:spacing w:lineRule="auto" w:line="240" w:before="20" w:after="20"/>
-              <w:jc w:val="start"/>
-              <w:rPr>
-                <w:kern w:val="0"/>
-                <w:sz w:val="22"/>
-                <w:szCs w:val="22"/>
-                <w:lang w:eastAsia="en-US" w:bidi="ar-SA"/>
-              </w:rPr>
-            </w:pPr>
-            <w:r>
-              <w:rPr>
-                <w:rFonts w:eastAsia="Times New Roman" w:cs="Times New Roman"/>
-                <w:b/>
-                <w:i w:val="false"/>
-                <w:kern w:val="0"/>
-                <w:sz w:val="18"/>
-                <w:szCs w:val="22"/>
-                <w:lang w:eastAsia="en-US" w:bidi="ar-SA"/>
-              </w:rPr>
-              <w:t>Ctx. P</w:t>
-            </w:r>
-          </w:p>
-        </w:tc>
-        <w:tc>
-          <w:tcPr>
-            <w:tcW w:w="798" w:type="dxa"/>
-            <w:tcBorders/>
-            <w:shd w:color="auto" w:fill="D9D9D9" w:val="clear"/>
-          </w:tcPr>
-          <w:p>
-            <w:pPr>
-              <w:pStyle w:val="Normal"/>
-              <w:keepNext w:val="true"/>
-              <w:suppressAutoHyphens w:val="true"/>
-              <w:spacing w:lineRule="auto" w:line="240" w:before="20" w:after="20"/>
-              <w:jc w:val="start"/>
-              <w:rPr>
-                <w:kern w:val="0"/>
-                <w:sz w:val="22"/>
-                <w:szCs w:val="22"/>
-                <w:lang w:eastAsia="en-US" w:bidi="ar-SA"/>
-              </w:rPr>
-            </w:pPr>
-            <w:r>
-              <w:rPr>
-                <w:rFonts w:eastAsia="Times New Roman" w:cs="Times New Roman"/>
-                <w:b/>
-                <w:i w:val="false"/>
-                <w:kern w:val="0"/>
-                <w:sz w:val="18"/>
-                <w:szCs w:val="22"/>
-                <w:lang w:eastAsia="en-US" w:bidi="ar-SA"/>
-              </w:rPr>
               <w:t>Ctx. R</w:t>
             </w:r>
           </w:p>
         </w:tc>
         <w:tc>
           <w:tcPr>
-            <w:tcW w:w="1102" w:type="dxa"/>
+            <w:tcW w:w="1103" w:type="dxa"/>
             <w:tcBorders/>
             <w:shd w:color="auto" w:fill="D9D9D9" w:val="clear"/>
           </w:tcPr>
@@ -32198,6 +32360,72 @@
         </w:tc>
         <w:tc>
           <w:tcPr>
+            <w:tcW w:w="899" w:type="dxa"/>
+            <w:tcBorders/>
+          </w:tcPr>
+          <w:p>
+            <w:pPr>
+              <w:pStyle w:val="Normal"/>
+              <w:keepNext w:val="true"/>
+              <w:suppressAutoHyphens w:val="true"/>
+              <w:spacing w:lineRule="auto" w:line="240" w:before="20" w:after="20"/>
+              <w:jc w:val="start"/>
+              <w:rPr>
+                <w:kern w:val="0"/>
+                <w:sz w:val="22"/>
+                <w:szCs w:val="22"/>
+                <w:lang w:eastAsia="en-US" w:bidi="ar-SA"/>
+              </w:rPr>
+            </w:pPr>
+            <w:r>
+              <w:rPr>
+                <w:rFonts w:eastAsia="Times New Roman" w:cs="Times New Roman"/>
+                <w:b w:val="false"/>
+                <w:i w:val="false"/>
+                <w:kern w:val="0"/>
+                <w:sz w:val="18"/>
+                <w:szCs w:val="22"/>
+                <w:lang w:eastAsia="en-US" w:bidi="ar-SA"/>
+              </w:rPr>
+              <w:t>.32</w:t>
+            </w:r>
+          </w:p>
+        </w:tc>
+        <w:tc>
+          <w:tcPr>
+            <w:tcW w:w="903" w:type="dxa"/>
+            <w:tcBorders/>
+          </w:tcPr>
+          <w:p>
+            <w:pPr>
+              <w:pStyle w:val="Normal"/>
+              <w:keepNext w:val="true"/>
+              <w:suppressAutoHyphens w:val="true"/>
+              <w:spacing w:lineRule="auto" w:line="240" w:before="20" w:after="20"/>
+              <w:jc w:val="start"/>
+              <w:rPr>
+                <w:kern w:val="0"/>
+                <w:sz w:val="22"/>
+                <w:szCs w:val="22"/>
+                <w:lang w:eastAsia="en-US" w:bidi="ar-SA"/>
+              </w:rPr>
+            </w:pPr>
+            <w:r>
+              <w:rPr>
+                <w:rFonts w:eastAsia="Times New Roman" w:cs="Times New Roman"/>
+                <w:b w:val="false"/>
+                <w:i w:val="false"/>
+                <w:kern w:val="0"/>
+                <w:sz w:val="18"/>
+                <w:szCs w:val="22"/>
+                <w:lang w:eastAsia="en-US" w:bidi="ar-SA"/>
+              </w:rPr>
+              <w:t>.59</w:t>
+            </w:r>
+          </w:p>
+        </w:tc>
+        <w:tc>
+          <w:tcPr>
             <w:tcW w:w="900" w:type="dxa"/>
             <w:tcBorders/>
           </w:tcPr>
@@ -32225,13 +32453,13 @@
                 <w:szCs w:val="22"/>
                 <w:lang w:eastAsia="en-US" w:bidi="ar-SA"/>
               </w:rPr>
-              <w:t>.32</w:t>
-            </w:r>
-          </w:p>
-        </w:tc>
-        <w:tc>
-          <w:tcPr>
-            <w:tcW w:w="902" w:type="dxa"/>
+              <w:t>–</w:t>
+            </w:r>
+          </w:p>
+        </w:tc>
+        <w:tc>
+          <w:tcPr>
+            <w:tcW w:w="897" w:type="dxa"/>
             <w:tcBorders/>
           </w:tcPr>
           <w:p>
@@ -32258,13 +32486,13 @@
                 <w:szCs w:val="22"/>
                 <w:lang w:eastAsia="en-US" w:bidi="ar-SA"/>
               </w:rPr>
-              <w:t>.59</w:t>
-            </w:r>
-          </w:p>
-        </w:tc>
-        <w:tc>
-          <w:tcPr>
-            <w:tcW w:w="900" w:type="dxa"/>
+              <w:t>–</w:t>
+            </w:r>
+          </w:p>
+        </w:tc>
+        <w:tc>
+          <w:tcPr>
+            <w:tcW w:w="803" w:type="dxa"/>
             <w:tcBorders/>
           </w:tcPr>
           <w:p>
@@ -32291,13 +32519,13 @@
                 <w:szCs w:val="22"/>
                 <w:lang w:eastAsia="en-US" w:bidi="ar-SA"/>
               </w:rPr>
-              <w:t>–</w:t>
-            </w:r>
-          </w:p>
-        </w:tc>
-        <w:tc>
-          <w:tcPr>
-            <w:tcW w:w="898" w:type="dxa"/>
+              <w:t>.00</w:t>
+            </w:r>
+          </w:p>
+        </w:tc>
+        <w:tc>
+          <w:tcPr>
+            <w:tcW w:w="797" w:type="dxa"/>
             <w:tcBorders/>
           </w:tcPr>
           <w:p>
@@ -32324,79 +32552,13 @@
                 <w:szCs w:val="22"/>
                 <w:lang w:eastAsia="en-US" w:bidi="ar-SA"/>
               </w:rPr>
-              <w:t>–</w:t>
-            </w:r>
-          </w:p>
-        </w:tc>
-        <w:tc>
-          <w:tcPr>
-            <w:tcW w:w="802" w:type="dxa"/>
-            <w:tcBorders/>
-          </w:tcPr>
-          <w:p>
-            <w:pPr>
-              <w:pStyle w:val="Normal"/>
-              <w:keepNext w:val="true"/>
-              <w:suppressAutoHyphens w:val="true"/>
-              <w:spacing w:lineRule="auto" w:line="240" w:before="20" w:after="20"/>
-              <w:jc w:val="start"/>
-              <w:rPr>
-                <w:kern w:val="0"/>
-                <w:sz w:val="22"/>
-                <w:szCs w:val="22"/>
-                <w:lang w:eastAsia="en-US" w:bidi="ar-SA"/>
-              </w:rPr>
-            </w:pPr>
-            <w:r>
-              <w:rPr>
-                <w:rFonts w:eastAsia="Times New Roman" w:cs="Times New Roman"/>
-                <w:b w:val="false"/>
-                <w:i w:val="false"/>
-                <w:kern w:val="0"/>
-                <w:sz w:val="18"/>
-                <w:szCs w:val="22"/>
-                <w:lang w:eastAsia="en-US" w:bidi="ar-SA"/>
-              </w:rPr>
               <w:t>.00</w:t>
             </w:r>
           </w:p>
         </w:tc>
         <w:tc>
           <w:tcPr>
-            <w:tcW w:w="798" w:type="dxa"/>
-            <w:tcBorders/>
-          </w:tcPr>
-          <w:p>
-            <w:pPr>
-              <w:pStyle w:val="Normal"/>
-              <w:keepNext w:val="true"/>
-              <w:suppressAutoHyphens w:val="true"/>
-              <w:spacing w:lineRule="auto" w:line="240" w:before="20" w:after="20"/>
-              <w:jc w:val="start"/>
-              <w:rPr>
-                <w:kern w:val="0"/>
-                <w:sz w:val="22"/>
-                <w:szCs w:val="22"/>
-                <w:lang w:eastAsia="en-US" w:bidi="ar-SA"/>
-              </w:rPr>
-            </w:pPr>
-            <w:r>
-              <w:rPr>
-                <w:rFonts w:eastAsia="Times New Roman" w:cs="Times New Roman"/>
-                <w:b w:val="false"/>
-                <w:i w:val="false"/>
-                <w:kern w:val="0"/>
-                <w:sz w:val="18"/>
-                <w:szCs w:val="22"/>
-                <w:lang w:eastAsia="en-US" w:bidi="ar-SA"/>
-              </w:rPr>
-              <w:t>.00</w:t>
-            </w:r>
-          </w:p>
-        </w:tc>
-        <w:tc>
-          <w:tcPr>
-            <w:tcW w:w="1102" w:type="dxa"/>
+            <w:tcW w:w="1103" w:type="dxa"/>
             <w:tcBorders/>
           </w:tcPr>
           <w:p>
@@ -32533,6 +32695,72 @@
         </w:tc>
         <w:tc>
           <w:tcPr>
+            <w:tcW w:w="899" w:type="dxa"/>
+            <w:tcBorders/>
+          </w:tcPr>
+          <w:p>
+            <w:pPr>
+              <w:pStyle w:val="Normal"/>
+              <w:keepNext w:val="true"/>
+              <w:suppressAutoHyphens w:val="true"/>
+              <w:spacing w:lineRule="auto" w:line="240" w:before="20" w:after="20"/>
+              <w:jc w:val="start"/>
+              <w:rPr>
+                <w:kern w:val="0"/>
+                <w:sz w:val="22"/>
+                <w:szCs w:val="22"/>
+                <w:lang w:eastAsia="en-US" w:bidi="ar-SA"/>
+              </w:rPr>
+            </w:pPr>
+            <w:r>
+              <w:rPr>
+                <w:rFonts w:eastAsia="Times New Roman" w:cs="Times New Roman"/>
+                <w:b w:val="false"/>
+                <w:i w:val="false"/>
+                <w:kern w:val="0"/>
+                <w:sz w:val="18"/>
+                <w:szCs w:val="22"/>
+                <w:lang w:eastAsia="en-US" w:bidi="ar-SA"/>
+              </w:rPr>
+              <w:t>.26</w:t>
+            </w:r>
+          </w:p>
+        </w:tc>
+        <w:tc>
+          <w:tcPr>
+            <w:tcW w:w="903" w:type="dxa"/>
+            <w:tcBorders/>
+          </w:tcPr>
+          <w:p>
+            <w:pPr>
+              <w:pStyle w:val="Normal"/>
+              <w:keepNext w:val="true"/>
+              <w:suppressAutoHyphens w:val="true"/>
+              <w:spacing w:lineRule="auto" w:line="240" w:before="20" w:after="20"/>
+              <w:jc w:val="start"/>
+              <w:rPr>
+                <w:kern w:val="0"/>
+                <w:sz w:val="22"/>
+                <w:szCs w:val="22"/>
+                <w:lang w:eastAsia="en-US" w:bidi="ar-SA"/>
+              </w:rPr>
+            </w:pPr>
+            <w:r>
+              <w:rPr>
+                <w:rFonts w:eastAsia="Times New Roman" w:cs="Times New Roman"/>
+                <w:b w:val="false"/>
+                <w:i w:val="false"/>
+                <w:kern w:val="0"/>
+                <w:sz w:val="18"/>
+                <w:szCs w:val="22"/>
+                <w:lang w:eastAsia="en-US" w:bidi="ar-SA"/>
+              </w:rPr>
+              <w:t>.86</w:t>
+            </w:r>
+          </w:p>
+        </w:tc>
+        <w:tc>
+          <w:tcPr>
             <w:tcW w:w="900" w:type="dxa"/>
             <w:tcBorders/>
           </w:tcPr>
@@ -32560,13 +32788,13 @@
                 <w:szCs w:val="22"/>
                 <w:lang w:eastAsia="en-US" w:bidi="ar-SA"/>
               </w:rPr>
-              <w:t>.26</w:t>
-            </w:r>
-          </w:p>
-        </w:tc>
-        <w:tc>
-          <w:tcPr>
-            <w:tcW w:w="902" w:type="dxa"/>
+              <w:t>.50</w:t>
+            </w:r>
+          </w:p>
+        </w:tc>
+        <w:tc>
+          <w:tcPr>
+            <w:tcW w:w="897" w:type="dxa"/>
             <w:tcBorders/>
           </w:tcPr>
           <w:p>
@@ -32593,13 +32821,13 @@
                 <w:szCs w:val="22"/>
                 <w:lang w:eastAsia="en-US" w:bidi="ar-SA"/>
               </w:rPr>
-              <w:t>.86</w:t>
-            </w:r>
-          </w:p>
-        </w:tc>
-        <w:tc>
-          <w:tcPr>
-            <w:tcW w:w="900" w:type="dxa"/>
+              <w:t>.30</w:t>
+            </w:r>
+          </w:p>
+        </w:tc>
+        <w:tc>
+          <w:tcPr>
+            <w:tcW w:w="803" w:type="dxa"/>
             <w:tcBorders/>
           </w:tcPr>
           <w:p>
@@ -32626,13 +32854,13 @@
                 <w:szCs w:val="22"/>
                 <w:lang w:eastAsia="en-US" w:bidi="ar-SA"/>
               </w:rPr>
-              <w:t>.50</w:t>
-            </w:r>
-          </w:p>
-        </w:tc>
-        <w:tc>
-          <w:tcPr>
-            <w:tcW w:w="898" w:type="dxa"/>
+              <w:t>.00</w:t>
+            </w:r>
+          </w:p>
+        </w:tc>
+        <w:tc>
+          <w:tcPr>
+            <w:tcW w:w="797" w:type="dxa"/>
             <w:tcBorders/>
           </w:tcPr>
           <w:p>
@@ -32659,79 +32887,13 @@
                 <w:szCs w:val="22"/>
                 <w:lang w:eastAsia="en-US" w:bidi="ar-SA"/>
               </w:rPr>
-              <w:t>.30</w:t>
-            </w:r>
-          </w:p>
-        </w:tc>
-        <w:tc>
-          <w:tcPr>
-            <w:tcW w:w="802" w:type="dxa"/>
-            <w:tcBorders/>
-          </w:tcPr>
-          <w:p>
-            <w:pPr>
-              <w:pStyle w:val="Normal"/>
-              <w:keepNext w:val="true"/>
-              <w:suppressAutoHyphens w:val="true"/>
-              <w:spacing w:lineRule="auto" w:line="240" w:before="20" w:after="20"/>
-              <w:jc w:val="start"/>
-              <w:rPr>
-                <w:kern w:val="0"/>
-                <w:sz w:val="22"/>
-                <w:szCs w:val="22"/>
-                <w:lang w:eastAsia="en-US" w:bidi="ar-SA"/>
-              </w:rPr>
-            </w:pPr>
-            <w:r>
-              <w:rPr>
-                <w:rFonts w:eastAsia="Times New Roman" w:cs="Times New Roman"/>
-                <w:b w:val="false"/>
-                <w:i w:val="false"/>
-                <w:kern w:val="0"/>
-                <w:sz w:val="18"/>
-                <w:szCs w:val="22"/>
-                <w:lang w:eastAsia="en-US" w:bidi="ar-SA"/>
-              </w:rPr>
               <w:t>.00</w:t>
             </w:r>
           </w:p>
         </w:tc>
         <w:tc>
           <w:tcPr>
-            <w:tcW w:w="798" w:type="dxa"/>
-            <w:tcBorders/>
-          </w:tcPr>
-          <w:p>
-            <w:pPr>
-              <w:pStyle w:val="Normal"/>
-              <w:keepNext w:val="true"/>
-              <w:suppressAutoHyphens w:val="true"/>
-              <w:spacing w:lineRule="auto" w:line="240" w:before="20" w:after="20"/>
-              <w:jc w:val="start"/>
-              <w:rPr>
-                <w:kern w:val="0"/>
-                <w:sz w:val="22"/>
-                <w:szCs w:val="22"/>
-                <w:lang w:eastAsia="en-US" w:bidi="ar-SA"/>
-              </w:rPr>
-            </w:pPr>
-            <w:r>
-              <w:rPr>
-                <w:rFonts w:eastAsia="Times New Roman" w:cs="Times New Roman"/>
-                <w:b w:val="false"/>
-                <w:i w:val="false"/>
-                <w:kern w:val="0"/>
-                <w:sz w:val="18"/>
-                <w:szCs w:val="22"/>
-                <w:lang w:eastAsia="en-US" w:bidi="ar-SA"/>
-              </w:rPr>
-              <w:t>.00</w:t>
-            </w:r>
-          </w:p>
-        </w:tc>
-        <w:tc>
-          <w:tcPr>
-            <w:tcW w:w="1102" w:type="dxa"/>
+            <w:tcW w:w="1103" w:type="dxa"/>
             <w:tcBorders/>
           </w:tcPr>
           <w:p>
@@ -32868,6 +33030,72 @@
         </w:tc>
         <w:tc>
           <w:tcPr>
+            <w:tcW w:w="899" w:type="dxa"/>
+            <w:tcBorders/>
+          </w:tcPr>
+          <w:p>
+            <w:pPr>
+              <w:pStyle w:val="Normal"/>
+              <w:keepNext w:val="true"/>
+              <w:suppressAutoHyphens w:val="true"/>
+              <w:spacing w:lineRule="auto" w:line="240" w:before="20" w:after="20"/>
+              <w:jc w:val="start"/>
+              <w:rPr>
+                <w:kern w:val="0"/>
+                <w:sz w:val="22"/>
+                <w:szCs w:val="22"/>
+                <w:lang w:eastAsia="en-US" w:bidi="ar-SA"/>
+              </w:rPr>
+            </w:pPr>
+            <w:r>
+              <w:rPr>
+                <w:rFonts w:eastAsia="Times New Roman" w:cs="Times New Roman"/>
+                <w:b w:val="false"/>
+                <w:i w:val="false"/>
+                <w:kern w:val="0"/>
+                <w:sz w:val="18"/>
+                <w:szCs w:val="22"/>
+                <w:lang w:eastAsia="en-US" w:bidi="ar-SA"/>
+              </w:rPr>
+              <w:t>.23</w:t>
+            </w:r>
+          </w:p>
+        </w:tc>
+        <w:tc>
+          <w:tcPr>
+            <w:tcW w:w="903" w:type="dxa"/>
+            <w:tcBorders/>
+          </w:tcPr>
+          <w:p>
+            <w:pPr>
+              <w:pStyle w:val="Normal"/>
+              <w:keepNext w:val="true"/>
+              <w:suppressAutoHyphens w:val="true"/>
+              <w:spacing w:lineRule="auto" w:line="240" w:before="20" w:after="20"/>
+              <w:jc w:val="start"/>
+              <w:rPr>
+                <w:kern w:val="0"/>
+                <w:sz w:val="22"/>
+                <w:szCs w:val="22"/>
+                <w:lang w:eastAsia="en-US" w:bidi="ar-SA"/>
+              </w:rPr>
+            </w:pPr>
+            <w:r>
+              <w:rPr>
+                <w:rFonts w:eastAsia="Times New Roman" w:cs="Times New Roman"/>
+                <w:b w:val="false"/>
+                <w:i w:val="false"/>
+                <w:kern w:val="0"/>
+                <w:sz w:val="18"/>
+                <w:szCs w:val="22"/>
+                <w:lang w:eastAsia="en-US" w:bidi="ar-SA"/>
+              </w:rPr>
+              <w:t>.40</w:t>
+            </w:r>
+          </w:p>
+        </w:tc>
+        <w:tc>
+          <w:tcPr>
             <w:tcW w:w="900" w:type="dxa"/>
             <w:tcBorders/>
           </w:tcPr>
@@ -32895,13 +33123,13 @@
                 <w:szCs w:val="22"/>
                 <w:lang w:eastAsia="en-US" w:bidi="ar-SA"/>
               </w:rPr>
-              <w:t>.23</w:t>
-            </w:r>
-          </w:p>
-        </w:tc>
-        <w:tc>
-          <w:tcPr>
-            <w:tcW w:w="902" w:type="dxa"/>
+              <w:t>–</w:t>
+            </w:r>
+          </w:p>
+        </w:tc>
+        <w:tc>
+          <w:tcPr>
+            <w:tcW w:w="897" w:type="dxa"/>
             <w:tcBorders/>
           </w:tcPr>
           <w:p>
@@ -32928,13 +33156,13 @@
                 <w:szCs w:val="22"/>
                 <w:lang w:eastAsia="en-US" w:bidi="ar-SA"/>
               </w:rPr>
-              <w:t>.40</w:t>
-            </w:r>
-          </w:p>
-        </w:tc>
-        <w:tc>
-          <w:tcPr>
-            <w:tcW w:w="900" w:type="dxa"/>
+              <w:t>–</w:t>
+            </w:r>
+          </w:p>
+        </w:tc>
+        <w:tc>
+          <w:tcPr>
+            <w:tcW w:w="803" w:type="dxa"/>
             <w:tcBorders/>
           </w:tcPr>
           <w:p>
@@ -32961,13 +33189,13 @@
                 <w:szCs w:val="22"/>
                 <w:lang w:eastAsia="en-US" w:bidi="ar-SA"/>
               </w:rPr>
-              <w:t>–</w:t>
-            </w:r>
-          </w:p>
-        </w:tc>
-        <w:tc>
-          <w:tcPr>
-            <w:tcW w:w="898" w:type="dxa"/>
+              <w:t>.13</w:t>
+            </w:r>
+          </w:p>
+        </w:tc>
+        <w:tc>
+          <w:tcPr>
+            <w:tcW w:w="797" w:type="dxa"/>
             <w:tcBorders/>
           </w:tcPr>
           <w:p>
@@ -32994,79 +33222,13 @@
                 <w:szCs w:val="22"/>
                 <w:lang w:eastAsia="en-US" w:bidi="ar-SA"/>
               </w:rPr>
-              <w:t>–</w:t>
-            </w:r>
-          </w:p>
-        </w:tc>
-        <w:tc>
-          <w:tcPr>
-            <w:tcW w:w="802" w:type="dxa"/>
-            <w:tcBorders/>
-          </w:tcPr>
-          <w:p>
-            <w:pPr>
-              <w:pStyle w:val="Normal"/>
-              <w:keepNext w:val="true"/>
-              <w:suppressAutoHyphens w:val="true"/>
-              <w:spacing w:lineRule="auto" w:line="240" w:before="20" w:after="20"/>
-              <w:jc w:val="start"/>
-              <w:rPr>
-                <w:kern w:val="0"/>
-                <w:sz w:val="22"/>
-                <w:szCs w:val="22"/>
-                <w:lang w:eastAsia="en-US" w:bidi="ar-SA"/>
-              </w:rPr>
-            </w:pPr>
-            <w:r>
-              <w:rPr>
-                <w:rFonts w:eastAsia="Times New Roman" w:cs="Times New Roman"/>
-                <w:b w:val="false"/>
-                <w:i w:val="false"/>
-                <w:kern w:val="0"/>
-                <w:sz w:val="18"/>
-                <w:szCs w:val="22"/>
-                <w:lang w:eastAsia="en-US" w:bidi="ar-SA"/>
-              </w:rPr>
-              <w:t>.13</w:t>
-            </w:r>
-          </w:p>
-        </w:tc>
-        <w:tc>
-          <w:tcPr>
-            <w:tcW w:w="798" w:type="dxa"/>
-            <w:tcBorders/>
-          </w:tcPr>
-          <w:p>
-            <w:pPr>
-              <w:pStyle w:val="Normal"/>
-              <w:keepNext w:val="true"/>
-              <w:suppressAutoHyphens w:val="true"/>
-              <w:spacing w:lineRule="auto" w:line="240" w:before="20" w:after="20"/>
-              <w:jc w:val="start"/>
-              <w:rPr>
-                <w:kern w:val="0"/>
-                <w:sz w:val="22"/>
-                <w:szCs w:val="22"/>
-                <w:lang w:eastAsia="en-US" w:bidi="ar-SA"/>
-              </w:rPr>
-            </w:pPr>
-            <w:r>
-              <w:rPr>
-                <w:rFonts w:eastAsia="Times New Roman" w:cs="Times New Roman"/>
-                <w:b w:val="false"/>
-                <w:i w:val="false"/>
-                <w:kern w:val="0"/>
-                <w:sz w:val="18"/>
-                <w:szCs w:val="22"/>
-                <w:lang w:eastAsia="en-US" w:bidi="ar-SA"/>
-              </w:rPr>
               <w:t>.17</w:t>
             </w:r>
           </w:p>
         </w:tc>
         <w:tc>
           <w:tcPr>
-            <w:tcW w:w="1102" w:type="dxa"/>
+            <w:tcW w:w="1103" w:type="dxa"/>
             <w:tcBorders/>
           </w:tcPr>
           <w:p>
@@ -33200,6 +33362,70 @@
         </w:tc>
         <w:tc>
           <w:tcPr>
+            <w:tcW w:w="899" w:type="dxa"/>
+            <w:tcBorders/>
+          </w:tcPr>
+          <w:p>
+            <w:pPr>
+              <w:pStyle w:val="Normal"/>
+              <w:suppressAutoHyphens w:val="true"/>
+              <w:spacing w:lineRule="auto" w:line="240" w:before="20" w:after="20"/>
+              <w:jc w:val="start"/>
+              <w:rPr>
+                <w:kern w:val="0"/>
+                <w:sz w:val="22"/>
+                <w:szCs w:val="22"/>
+                <w:lang w:eastAsia="en-US" w:bidi="ar-SA"/>
+              </w:rPr>
+            </w:pPr>
+            <w:r>
+              <w:rPr>
+                <w:rFonts w:eastAsia="Times New Roman" w:cs="Times New Roman"/>
+                <w:b w:val="false"/>
+                <w:i w:val="false"/>
+                <w:kern w:val="0"/>
+                <w:sz w:val="18"/>
+                <w:szCs w:val="22"/>
+                <w:lang w:eastAsia="en-US" w:bidi="ar-SA"/>
+              </w:rPr>
+              <w:t>.25</w:t>
+            </w:r>
+          </w:p>
+        </w:tc>
+        <w:tc>
+          <w:tcPr>
+            <w:tcW w:w="903" w:type="dxa"/>
+            <w:tcBorders/>
+          </w:tcPr>
+          <w:p>
+            <w:pPr>
+              <w:pStyle w:val="Normal"/>
+              <w:suppressAutoHyphens w:val="true"/>
+              <w:spacing w:lineRule="auto" w:line="240" w:before="20" w:after="20"/>
+              <w:jc w:val="start"/>
+              <w:rPr>
+                <w:kern w:val="0"/>
+                <w:sz w:val="22"/>
+                <w:szCs w:val="22"/>
+                <w:lang w:eastAsia="en-US" w:bidi="ar-SA"/>
+              </w:rPr>
+            </w:pPr>
+            <w:r>
+              <w:rPr>
+                <w:rFonts w:eastAsia="Times New Roman" w:cs="Times New Roman"/>
+                <w:b w:val="false"/>
+                <w:i w:val="false"/>
+                <w:kern w:val="0"/>
+                <w:sz w:val="18"/>
+                <w:szCs w:val="22"/>
+                <w:lang w:eastAsia="en-US" w:bidi="ar-SA"/>
+              </w:rPr>
+              <w:t>.90</w:t>
+            </w:r>
+          </w:p>
+        </w:tc>
+        <w:tc>
+          <w:tcPr>
             <w:tcW w:w="900" w:type="dxa"/>
             <w:tcBorders/>
           </w:tcPr>
@@ -33226,13 +33452,13 @@
                 <w:szCs w:val="22"/>
                 <w:lang w:eastAsia="en-US" w:bidi="ar-SA"/>
               </w:rPr>
-              <w:t>.25</w:t>
-            </w:r>
-          </w:p>
-        </w:tc>
-        <w:tc>
-          <w:tcPr>
-            <w:tcW w:w="902" w:type="dxa"/>
+              <w:t>.66</w:t>
+            </w:r>
+          </w:p>
+        </w:tc>
+        <w:tc>
+          <w:tcPr>
+            <w:tcW w:w="897" w:type="dxa"/>
             <w:tcBorders/>
           </w:tcPr>
           <w:p>
@@ -33258,13 +33484,13 @@
                 <w:szCs w:val="22"/>
                 <w:lang w:eastAsia="en-US" w:bidi="ar-SA"/>
               </w:rPr>
-              <w:t>.90</w:t>
-            </w:r>
-          </w:p>
-        </w:tc>
-        <w:tc>
-          <w:tcPr>
-            <w:tcW w:w="900" w:type="dxa"/>
+              <w:t>.80</w:t>
+            </w:r>
+          </w:p>
+        </w:tc>
+        <w:tc>
+          <w:tcPr>
+            <w:tcW w:w="803" w:type="dxa"/>
             <w:tcBorders/>
           </w:tcPr>
           <w:p>
@@ -33290,13 +33516,13 @@
                 <w:szCs w:val="22"/>
                 <w:lang w:eastAsia="en-US" w:bidi="ar-SA"/>
               </w:rPr>
-              <w:t>.66</w:t>
-            </w:r>
-          </w:p>
-        </w:tc>
-        <w:tc>
-          <w:tcPr>
-            <w:tcW w:w="898" w:type="dxa"/>
+              <w:t>.12</w:t>
+            </w:r>
+          </w:p>
+        </w:tc>
+        <w:tc>
+          <w:tcPr>
+            <w:tcW w:w="797" w:type="dxa"/>
             <w:tcBorders/>
           </w:tcPr>
           <w:p>
@@ -33322,77 +33548,13 @@
                 <w:szCs w:val="22"/>
                 <w:lang w:eastAsia="en-US" w:bidi="ar-SA"/>
               </w:rPr>
-              <w:t>.80</w:t>
-            </w:r>
-          </w:p>
-        </w:tc>
-        <w:tc>
-          <w:tcPr>
-            <w:tcW w:w="802" w:type="dxa"/>
-            <w:tcBorders/>
-          </w:tcPr>
-          <w:p>
-            <w:pPr>
-              <w:pStyle w:val="Normal"/>
-              <w:suppressAutoHyphens w:val="true"/>
-              <w:spacing w:lineRule="auto" w:line="240" w:before="20" w:after="20"/>
-              <w:jc w:val="start"/>
-              <w:rPr>
-                <w:kern w:val="0"/>
-                <w:sz w:val="22"/>
-                <w:szCs w:val="22"/>
-                <w:lang w:eastAsia="en-US" w:bidi="ar-SA"/>
-              </w:rPr>
-            </w:pPr>
-            <w:r>
-              <w:rPr>
-                <w:rFonts w:eastAsia="Times New Roman" w:cs="Times New Roman"/>
-                <w:b w:val="false"/>
-                <w:i w:val="false"/>
-                <w:kern w:val="0"/>
-                <w:sz w:val="18"/>
-                <w:szCs w:val="22"/>
-                <w:lang w:eastAsia="en-US" w:bidi="ar-SA"/>
-              </w:rPr>
-              <w:t>.12</w:t>
-            </w:r>
-          </w:p>
-        </w:tc>
-        <w:tc>
-          <w:tcPr>
-            <w:tcW w:w="798" w:type="dxa"/>
-            <w:tcBorders/>
-          </w:tcPr>
-          <w:p>
-            <w:pPr>
-              <w:pStyle w:val="Normal"/>
-              <w:suppressAutoHyphens w:val="true"/>
-              <w:spacing w:lineRule="auto" w:line="240" w:before="20" w:after="20"/>
-              <w:jc w:val="start"/>
-              <w:rPr>
-                <w:kern w:val="0"/>
-                <w:sz w:val="22"/>
-                <w:szCs w:val="22"/>
-                <w:lang w:eastAsia="en-US" w:bidi="ar-SA"/>
-              </w:rPr>
-            </w:pPr>
-            <w:r>
-              <w:rPr>
-                <w:rFonts w:eastAsia="Times New Roman" w:cs="Times New Roman"/>
-                <w:b w:val="false"/>
-                <w:i w:val="false"/>
-                <w:kern w:val="0"/>
-                <w:sz w:val="18"/>
-                <w:szCs w:val="22"/>
-                <w:lang w:eastAsia="en-US" w:bidi="ar-SA"/>
-              </w:rPr>
               <w:t>.20</w:t>
             </w:r>
           </w:p>
         </w:tc>
         <w:tc>
           <w:tcPr>
-            <w:tcW w:w="1102" w:type="dxa"/>
+            <w:tcW w:w="1103" w:type="dxa"/>
             <w:tcBorders/>
           </w:tcPr>
           <w:p>
@@ -33631,11 +33793,11 @@
         <w:tblLook w:noHBand="0" w:noVBand="1" w:firstColumn="1" w:lastRow="0" w:lastColumn="0" w:firstRow="1" w:val="04a0"/>
       </w:tblPr>
       <w:tblGrid>
-        <w:gridCol w:w="1498"/>
+        <w:gridCol w:w="1497"/>
         <w:gridCol w:w="950"/>
         <w:gridCol w:w="950"/>
         <w:gridCol w:w="950"/>
-        <w:gridCol w:w="950"/>
+        <w:gridCol w:w="951"/>
         <w:gridCol w:w="950"/>
         <w:gridCol w:w="951"/>
         <w:gridCol w:w="950"/>
@@ -33648,7 +33810,7 @@
         </w:trPr>
         <w:tc>
           <w:tcPr>
-            <w:tcW w:w="1498" w:type="dxa"/>
+            <w:tcW w:w="1497" w:type="dxa"/>
             <w:tcBorders/>
             <w:shd w:color="auto" w:fill="D9D9D9" w:val="clear"/>
           </w:tcPr>
@@ -33784,7 +33946,7 @@
         </w:tc>
         <w:tc>
           <w:tcPr>
-            <w:tcW w:w="950" w:type="dxa"/>
+            <w:tcW w:w="951" w:type="dxa"/>
             <w:tcBorders/>
             <w:shd w:color="auto" w:fill="D9D9D9" w:val="clear"/>
           </w:tcPr>
@@ -33959,7 +34121,7 @@
         </w:trPr>
         <w:tc>
           <w:tcPr>
-            <w:tcW w:w="1498" w:type="dxa"/>
+            <w:tcW w:w="1497" w:type="dxa"/>
             <w:tcBorders/>
           </w:tcPr>
           <w:p>
@@ -34091,7 +34253,7 @@
         </w:tc>
         <w:tc>
           <w:tcPr>
-            <w:tcW w:w="950" w:type="dxa"/>
+            <w:tcW w:w="951" w:type="dxa"/>
             <w:tcBorders/>
           </w:tcPr>
           <w:p>
@@ -34261,7 +34423,7 @@
         </w:trPr>
         <w:tc>
           <w:tcPr>
-            <w:tcW w:w="1498" w:type="dxa"/>
+            <w:tcW w:w="1497" w:type="dxa"/>
             <w:tcBorders/>
           </w:tcPr>
           <w:p>
@@ -34393,7 +34555,7 @@
         </w:tc>
         <w:tc>
           <w:tcPr>
-            <w:tcW w:w="950" w:type="dxa"/>
+            <w:tcW w:w="951" w:type="dxa"/>
             <w:tcBorders/>
           </w:tcPr>
           <w:p>
@@ -34563,7 +34725,7 @@
         </w:trPr>
         <w:tc>
           <w:tcPr>
-            <w:tcW w:w="1498" w:type="dxa"/>
+            <w:tcW w:w="1497" w:type="dxa"/>
             <w:tcBorders/>
           </w:tcPr>
           <w:p>
@@ -34691,7 +34853,7 @@
         </w:tc>
         <w:tc>
           <w:tcPr>
-            <w:tcW w:w="950" w:type="dxa"/>
+            <w:tcW w:w="951" w:type="dxa"/>
             <w:tcBorders/>
           </w:tcPr>
           <w:p>
@@ -34964,8 +35126,8 @@
         <w:gridCol w:w="3000"/>
         <w:gridCol w:w="900"/>
         <w:gridCol w:w="1000"/>
-        <w:gridCol w:w="1098"/>
-        <w:gridCol w:w="1100"/>
+        <w:gridCol w:w="1097"/>
+        <w:gridCol w:w="1101"/>
         <w:gridCol w:w="1102"/>
         <w:gridCol w:w="900"/>
       </w:tblGrid>
@@ -35078,7 +35240,7 @@
         </w:tc>
         <w:tc>
           <w:tcPr>
-            <w:tcW w:w="1098" w:type="dxa"/>
+            <w:tcW w:w="1097" w:type="dxa"/>
             <w:tcBorders/>
             <w:shd w:color="auto" w:fill="D9D9D9" w:val="clear"/>
           </w:tcPr>
@@ -35112,7 +35274,7 @@
         </w:tc>
         <w:tc>
           <w:tcPr>
-            <w:tcW w:w="1100" w:type="dxa"/>
+            <w:tcW w:w="1101" w:type="dxa"/>
             <w:tcBorders/>
             <w:shd w:color="auto" w:fill="D9D9D9" w:val="clear"/>
           </w:tcPr>
@@ -35318,7 +35480,7 @@
         </w:tc>
         <w:tc>
           <w:tcPr>
-            <w:tcW w:w="1098" w:type="dxa"/>
+            <w:tcW w:w="1097" w:type="dxa"/>
             <w:tcBorders/>
           </w:tcPr>
           <w:p>
@@ -35351,7 +35513,7 @@
         </w:tc>
         <w:tc>
           <w:tcPr>
-            <w:tcW w:w="1100" w:type="dxa"/>
+            <w:tcW w:w="1101" w:type="dxa"/>
             <w:tcBorders/>
           </w:tcPr>
           <w:p>
@@ -35554,7 +35716,7 @@
         </w:tc>
         <w:tc>
           <w:tcPr>
-            <w:tcW w:w="1098" w:type="dxa"/>
+            <w:tcW w:w="1097" w:type="dxa"/>
             <w:tcBorders/>
           </w:tcPr>
           <w:p>
@@ -35587,7 +35749,7 @@
         </w:tc>
         <w:tc>
           <w:tcPr>
-            <w:tcW w:w="1100" w:type="dxa"/>
+            <w:tcW w:w="1101" w:type="dxa"/>
             <w:tcBorders/>
           </w:tcPr>
           <w:p>
@@ -35790,7 +35952,7 @@
         </w:tc>
         <w:tc>
           <w:tcPr>
-            <w:tcW w:w="1098" w:type="dxa"/>
+            <w:tcW w:w="1097" w:type="dxa"/>
             <w:tcBorders/>
           </w:tcPr>
           <w:p>
@@ -35823,7 +35985,7 @@
         </w:tc>
         <w:tc>
           <w:tcPr>
-            <w:tcW w:w="1100" w:type="dxa"/>
+            <w:tcW w:w="1101" w:type="dxa"/>
             <w:tcBorders/>
           </w:tcPr>
           <w:p>
@@ -36026,7 +36188,7 @@
         </w:tc>
         <w:tc>
           <w:tcPr>
-            <w:tcW w:w="1098" w:type="dxa"/>
+            <w:tcW w:w="1097" w:type="dxa"/>
             <w:tcBorders/>
           </w:tcPr>
           <w:p>
@@ -36059,7 +36221,7 @@
         </w:tc>
         <w:tc>
           <w:tcPr>
-            <w:tcW w:w="1100" w:type="dxa"/>
+            <w:tcW w:w="1101" w:type="dxa"/>
             <w:tcBorders/>
           </w:tcPr>
           <w:p>
@@ -36259,7 +36421,7 @@
         </w:tc>
         <w:tc>
           <w:tcPr>
-            <w:tcW w:w="1098" w:type="dxa"/>
+            <w:tcW w:w="1097" w:type="dxa"/>
             <w:tcBorders/>
           </w:tcPr>
           <w:p>
@@ -36291,7 +36453,7 @@
         </w:tc>
         <w:tc>
           <w:tcPr>
-            <w:tcW w:w="1100" w:type="dxa"/>
+            <w:tcW w:w="1101" w:type="dxa"/>
             <w:tcBorders/>
           </w:tcPr>
           <w:p>
@@ -36497,8 +36659,8 @@
         <w:tblLook w:noHBand="0" w:noVBand="1" w:firstColumn="1" w:lastRow="0" w:lastColumn="0" w:firstRow="1" w:val="04a0"/>
       </w:tblPr>
       <w:tblGrid>
-        <w:gridCol w:w="4298"/>
-        <w:gridCol w:w="1602"/>
+        <w:gridCol w:w="4297"/>
+        <w:gridCol w:w="1603"/>
         <w:gridCol w:w="1600"/>
         <w:gridCol w:w="1600"/>
       </w:tblGrid>
@@ -36509,7 +36671,7 @@
         </w:trPr>
         <w:tc>
           <w:tcPr>
-            <w:tcW w:w="4298" w:type="dxa"/>
+            <w:tcW w:w="4297" w:type="dxa"/>
             <w:tcBorders/>
             <w:shd w:color="auto" w:fill="D9D9D9" w:val="clear"/>
           </w:tcPr>
@@ -36543,7 +36705,7 @@
         </w:tc>
         <w:tc>
           <w:tcPr>
-            <w:tcW w:w="1602" w:type="dxa"/>
+            <w:tcW w:w="1603" w:type="dxa"/>
             <w:tcBorders/>
             <w:shd w:color="auto" w:fill="D9D9D9" w:val="clear"/>
           </w:tcPr>
@@ -36650,7 +36812,7 @@
         </w:trPr>
         <w:tc>
           <w:tcPr>
-            <w:tcW w:w="4298" w:type="dxa"/>
+            <w:tcW w:w="4297" w:type="dxa"/>
             <w:tcBorders/>
           </w:tcPr>
           <w:p>
@@ -36683,7 +36845,7 @@
         </w:tc>
         <w:tc>
           <w:tcPr>
-            <w:tcW w:w="1602" w:type="dxa"/>
+            <w:tcW w:w="1603" w:type="dxa"/>
             <w:tcBorders/>
           </w:tcPr>
           <w:p>
@@ -36787,7 +36949,7 @@
         </w:trPr>
         <w:tc>
           <w:tcPr>
-            <w:tcW w:w="4298" w:type="dxa"/>
+            <w:tcW w:w="4297" w:type="dxa"/>
             <w:tcBorders/>
           </w:tcPr>
           <w:p>
@@ -36820,7 +36982,7 @@
         </w:tc>
         <w:tc>
           <w:tcPr>
-            <w:tcW w:w="1602" w:type="dxa"/>
+            <w:tcW w:w="1603" w:type="dxa"/>
             <w:tcBorders/>
           </w:tcPr>
           <w:p>
@@ -36924,7 +37086,7 @@
         </w:trPr>
         <w:tc>
           <w:tcPr>
-            <w:tcW w:w="4298" w:type="dxa"/>
+            <w:tcW w:w="4297" w:type="dxa"/>
             <w:tcBorders/>
           </w:tcPr>
           <w:p>
@@ -36957,7 +37119,7 @@
         </w:tc>
         <w:tc>
           <w:tcPr>
-            <w:tcW w:w="1602" w:type="dxa"/>
+            <w:tcW w:w="1603" w:type="dxa"/>
             <w:tcBorders/>
           </w:tcPr>
           <w:p>
@@ -37061,7 +37223,7 @@
         </w:trPr>
         <w:tc>
           <w:tcPr>
-            <w:tcW w:w="4298" w:type="dxa"/>
+            <w:tcW w:w="4297" w:type="dxa"/>
             <w:tcBorders/>
           </w:tcPr>
           <w:p>
@@ -37094,7 +37256,7 @@
         </w:tc>
         <w:tc>
           <w:tcPr>
-            <w:tcW w:w="1602" w:type="dxa"/>
+            <w:tcW w:w="1603" w:type="dxa"/>
             <w:tcBorders/>
           </w:tcPr>
           <w:p>
@@ -37198,7 +37360,7 @@
         </w:trPr>
         <w:tc>
           <w:tcPr>
-            <w:tcW w:w="4298" w:type="dxa"/>
+            <w:tcW w:w="4297" w:type="dxa"/>
             <w:tcBorders/>
           </w:tcPr>
           <w:p>
@@ -37231,7 +37393,7 @@
         </w:tc>
         <w:tc>
           <w:tcPr>
-            <w:tcW w:w="1602" w:type="dxa"/>
+            <w:tcW w:w="1603" w:type="dxa"/>
             <w:tcBorders/>
           </w:tcPr>
           <w:p>
@@ -37335,7 +37497,7 @@
         </w:trPr>
         <w:tc>
           <w:tcPr>
-            <w:tcW w:w="4298" w:type="dxa"/>
+            <w:tcW w:w="4297" w:type="dxa"/>
             <w:tcBorders/>
           </w:tcPr>
           <w:p>
@@ -37368,7 +37530,7 @@
         </w:tc>
         <w:tc>
           <w:tcPr>
-            <w:tcW w:w="1602" w:type="dxa"/>
+            <w:tcW w:w="1603" w:type="dxa"/>
             <w:tcBorders/>
           </w:tcPr>
           <w:p>
@@ -37472,7 +37634,7 @@
         </w:trPr>
         <w:tc>
           <w:tcPr>
-            <w:tcW w:w="4298" w:type="dxa"/>
+            <w:tcW w:w="4297" w:type="dxa"/>
             <w:tcBorders/>
           </w:tcPr>
           <w:p>
@@ -37504,7 +37666,7 @@
         </w:tc>
         <w:tc>
           <w:tcPr>
-            <w:tcW w:w="1602" w:type="dxa"/>
+            <w:tcW w:w="1603" w:type="dxa"/>
             <w:tcBorders/>
           </w:tcPr>
           <w:p>
@@ -41360,7 +41522,7 @@
       <mc:AlternateContent>
         <mc:Choice Requires="wps">
           <w:drawing>
-            <wp:anchor distT="0" distB="0" distL="0" distR="0" simplePos="0" relativeHeight="75" behindDoc="1" locked="0" layoutInCell="0" allowOverlap="1" wp14:anchorId="28AB78F1">
+            <wp:anchor distT="0" distB="0" distL="0" distR="0" simplePos="0" relativeHeight="77" behindDoc="1" locked="0" layoutInCell="0" allowOverlap="1" wp14:anchorId="28AB78F1">
               <wp:simplePos x="0" y="0"/>
               <wp:positionH relativeFrom="page">
                 <wp:posOffset>1663700</wp:posOffset>
@@ -41399,7 +41561,7 @@
                       <w:txbxContent>
                         <w:p>
                           <w:pPr>
-                            <w:pStyle w:val="FrameContentsuser"/>
+                            <w:pStyle w:val="FrameContents"/>
                             <w:spacing w:before="178" w:after="0"/>
                             <w:ind w:start="4" w:end="2"/>
                             <w:jc w:val="center"/>
@@ -41434,7 +41596,7 @@
                 <w:txbxContent>
                   <w:p>
                     <w:pPr>
-                      <w:pStyle w:val="FrameContentsuser"/>
+                      <w:pStyle w:val="FrameContents"/>
                       <w:spacing w:before="178" w:after="0"/>
                       <w:ind w:start="4" w:end="2"/>
                       <w:jc w:val="center"/>
@@ -41480,7 +41642,7 @@
       <mc:AlternateContent>
         <mc:Choice Requires="wps">
           <w:drawing>
-            <wp:anchor distT="0" distB="0" distL="0" distR="0" simplePos="0" relativeHeight="75" behindDoc="1" locked="0" layoutInCell="0" allowOverlap="1" wp14:anchorId="28AB78F1">
+            <wp:anchor distT="0" distB="0" distL="0" distR="0" simplePos="0" relativeHeight="77" behindDoc="1" locked="0" layoutInCell="0" allowOverlap="1" wp14:anchorId="28AB78F1">
               <wp:simplePos x="0" y="0"/>
               <wp:positionH relativeFrom="page">
                 <wp:posOffset>1663700</wp:posOffset>
@@ -41519,7 +41681,7 @@
                       <w:txbxContent>
                         <w:p>
                           <w:pPr>
-                            <w:pStyle w:val="FrameContentsuser"/>
+                            <w:pStyle w:val="FrameContents"/>
                             <w:spacing w:before="178" w:after="0"/>
                             <w:ind w:start="4" w:end="2"/>
                             <w:jc w:val="center"/>
@@ -41554,7 +41716,7 @@
                 <w:txbxContent>
                   <w:p>
                     <w:pPr>
-                      <w:pStyle w:val="FrameContentsuser"/>
+                      <w:pStyle w:val="FrameContents"/>
                       <w:spacing w:before="178" w:after="0"/>
                       <w:ind w:start="4" w:end="2"/>
                       <w:jc w:val="center"/>
@@ -41614,7 +41776,7 @@
       <mc:AlternateContent>
         <mc:Choice Requires="wps">
           <w:drawing>
-            <wp:anchor distT="0" distB="0" distL="0" distR="0" simplePos="0" relativeHeight="77" behindDoc="1" locked="0" layoutInCell="0" allowOverlap="1" wp14:anchorId="28AB78F1">
+            <wp:anchor distT="0" distB="0" distL="0" distR="0" simplePos="0" relativeHeight="80" behindDoc="1" locked="0" layoutInCell="0" allowOverlap="1" wp14:anchorId="28AB78F1">
               <wp:simplePos x="0" y="0"/>
               <wp:positionH relativeFrom="page">
                 <wp:posOffset>1663700</wp:posOffset>
@@ -41653,7 +41815,7 @@
                       <w:txbxContent>
                         <w:p>
                           <w:pPr>
-                            <w:pStyle w:val="FrameContentsuser"/>
+                            <w:pStyle w:val="FrameContents"/>
                             <w:spacing w:before="178" w:after="0"/>
                             <w:ind w:start="4" w:end="2"/>
                             <w:jc w:val="center"/>
@@ -41688,7 +41850,7 @@
                 <w:txbxContent>
                   <w:p>
                     <w:pPr>
-                      <w:pStyle w:val="FrameContentsuser"/>
+                      <w:pStyle w:val="FrameContents"/>
                       <w:spacing w:before="178" w:after="0"/>
                       <w:ind w:start="4" w:end="2"/>
                       <w:jc w:val="center"/>
@@ -41734,7 +41896,7 @@
       <mc:AlternateContent>
         <mc:Choice Requires="wps">
           <w:drawing>
-            <wp:anchor distT="0" distB="0" distL="0" distR="0" simplePos="0" relativeHeight="77" behindDoc="1" locked="0" layoutInCell="0" allowOverlap="1" wp14:anchorId="28AB78F1">
+            <wp:anchor distT="0" distB="0" distL="0" distR="0" simplePos="0" relativeHeight="80" behindDoc="1" locked="0" layoutInCell="0" allowOverlap="1" wp14:anchorId="28AB78F1">
               <wp:simplePos x="0" y="0"/>
               <wp:positionH relativeFrom="page">
                 <wp:posOffset>1663700</wp:posOffset>
@@ -41773,7 +41935,7 @@
                       <w:txbxContent>
                         <w:p>
                           <w:pPr>
-                            <w:pStyle w:val="FrameContentsuser"/>
+                            <w:pStyle w:val="FrameContents"/>
                             <w:spacing w:before="178" w:after="0"/>
                             <w:ind w:start="4" w:end="2"/>
                             <w:jc w:val="center"/>
@@ -41808,7 +41970,7 @@
                 <w:txbxContent>
                   <w:p>
                     <w:pPr>
-                      <w:pStyle w:val="FrameContentsuser"/>
+                      <w:pStyle w:val="FrameContents"/>
                       <w:spacing w:before="178" w:after="0"/>
                       <w:ind w:start="4" w:end="2"/>
                       <w:jc w:val="center"/>
@@ -41868,7 +42030,7 @@
       <mc:AlternateContent>
         <mc:Choice Requires="wps">
           <w:drawing>
-            <wp:anchor distT="0" distB="0" distL="0" distR="0" simplePos="0" relativeHeight="109" behindDoc="1" locked="0" layoutInCell="0" allowOverlap="1" wp14:anchorId="28AB78F1">
+            <wp:anchor distT="0" distB="0" distL="0" distR="0" simplePos="0" relativeHeight="113" behindDoc="1" locked="0" layoutInCell="0" allowOverlap="1" wp14:anchorId="28AB78F1">
               <wp:simplePos x="0" y="0"/>
               <wp:positionH relativeFrom="page">
                 <wp:posOffset>1663700</wp:posOffset>
@@ -41907,7 +42069,7 @@
                       <w:txbxContent>
                         <w:p>
                           <w:pPr>
-                            <w:pStyle w:val="FrameContentsuser"/>
+                            <w:pStyle w:val="FrameContents"/>
                             <w:spacing w:before="178" w:after="0"/>
                             <w:ind w:start="4" w:end="2"/>
                             <w:jc w:val="center"/>
@@ -41942,7 +42104,7 @@
                 <w:txbxContent>
                   <w:p>
                     <w:pPr>
-                      <w:pStyle w:val="FrameContentsuser"/>
+                      <w:pStyle w:val="FrameContents"/>
                       <w:spacing w:before="178" w:after="0"/>
                       <w:ind w:start="4" w:end="2"/>
                       <w:jc w:val="center"/>
@@ -41988,7 +42150,7 @@
       <mc:AlternateContent>
         <mc:Choice Requires="wps">
           <w:drawing>
-            <wp:anchor distT="0" distB="0" distL="0" distR="0" simplePos="0" relativeHeight="109" behindDoc="1" locked="0" layoutInCell="0" allowOverlap="1" wp14:anchorId="28AB78F1">
+            <wp:anchor distT="0" distB="0" distL="0" distR="0" simplePos="0" relativeHeight="113" behindDoc="1" locked="0" layoutInCell="0" allowOverlap="1" wp14:anchorId="28AB78F1">
               <wp:simplePos x="0" y="0"/>
               <wp:positionH relativeFrom="page">
                 <wp:posOffset>1663700</wp:posOffset>
@@ -42027,7 +42189,7 @@
                       <w:txbxContent>
                         <w:p>
                           <w:pPr>
-                            <w:pStyle w:val="FrameContentsuser"/>
+                            <w:pStyle w:val="FrameContents"/>
                             <w:spacing w:before="178" w:after="0"/>
                             <w:ind w:start="4" w:end="2"/>
                             <w:jc w:val="center"/>
@@ -42062,7 +42224,7 @@
                 <w:txbxContent>
                   <w:p>
                     <w:pPr>
-                      <w:pStyle w:val="FrameContentsuser"/>
+                      <w:pStyle w:val="FrameContents"/>
                       <w:spacing w:before="178" w:after="0"/>
                       <w:ind w:start="4" w:end="2"/>
                       <w:jc w:val="center"/>
@@ -42161,7 +42323,7 @@
                       <w:txbxContent>
                         <w:p>
                           <w:pPr>
-                            <w:pStyle w:val="FrameContentsuser"/>
+                            <w:pStyle w:val="FrameContents"/>
                             <w:spacing w:before="178" w:after="0"/>
                             <w:ind w:start="4" w:end="2"/>
                             <w:jc w:val="center"/>
@@ -42196,7 +42358,7 @@
                 <w:txbxContent>
                   <w:p>
                     <w:pPr>
-                      <w:pStyle w:val="FrameContentsuser"/>
+                      <w:pStyle w:val="FrameContents"/>
                       <w:spacing w:before="178" w:after="0"/>
                       <w:ind w:start="4" w:end="2"/>
                       <w:jc w:val="center"/>
@@ -42242,7 +42404,7 @@
       <mc:AlternateContent>
         <mc:Choice Requires="wps">
           <w:drawing>
-            <wp:anchor distT="0" distB="0" distL="0" distR="0" simplePos="0" relativeHeight="113" behindDoc="1" locked="0" layoutInCell="0" allowOverlap="1" wp14:anchorId="28AB78F1">
+            <wp:anchor distT="0" distB="0" distL="0" distR="0" simplePos="0" relativeHeight="118" behindDoc="1" locked="0" layoutInCell="0" allowOverlap="1" wp14:anchorId="28AB78F1">
               <wp:simplePos x="0" y="0"/>
               <wp:positionH relativeFrom="page">
                 <wp:posOffset>1663700</wp:posOffset>
@@ -42281,7 +42443,7 @@
                       <w:txbxContent>
                         <w:p>
                           <w:pPr>
-                            <w:pStyle w:val="FrameContentsuser"/>
+                            <w:pStyle w:val="FrameContents"/>
                             <w:spacing w:before="178" w:after="0"/>
                             <w:ind w:start="4" w:end="2"/>
                             <w:jc w:val="center"/>
@@ -42316,7 +42478,7 @@
                 <w:txbxContent>
                   <w:p>
                     <w:pPr>
-                      <w:pStyle w:val="FrameContentsuser"/>
+                      <w:pStyle w:val="FrameContents"/>
                       <w:spacing w:before="178" w:after="0"/>
                       <w:ind w:start="4" w:end="2"/>
                       <w:jc w:val="center"/>
@@ -42362,7 +42524,7 @@
       <mc:AlternateContent>
         <mc:Choice Requires="wps">
           <w:drawing>
-            <wp:anchor distT="0" distB="0" distL="0" distR="0" simplePos="0" relativeHeight="113" behindDoc="1" locked="0" layoutInCell="0" allowOverlap="1" wp14:anchorId="28AB78F1">
+            <wp:anchor distT="0" distB="0" distL="0" distR="0" simplePos="0" relativeHeight="118" behindDoc="1" locked="0" layoutInCell="0" allowOverlap="1" wp14:anchorId="28AB78F1">
               <wp:simplePos x="0" y="0"/>
               <wp:positionH relativeFrom="page">
                 <wp:posOffset>1663700</wp:posOffset>
@@ -42401,7 +42563,7 @@
                       <w:txbxContent>
                         <w:p>
                           <w:pPr>
-                            <w:pStyle w:val="FrameContentsuser"/>
+                            <w:pStyle w:val="FrameContents"/>
                             <w:spacing w:before="178" w:after="0"/>
                             <w:ind w:start="4" w:end="2"/>
                             <w:jc w:val="center"/>
@@ -42436,7 +42598,7 @@
                 <w:txbxContent>
                   <w:p>
                     <w:pPr>
-                      <w:pStyle w:val="FrameContentsuser"/>
+                      <w:pStyle w:val="FrameContents"/>
                       <w:spacing w:before="178" w:after="0"/>
                       <w:ind w:start="4" w:end="2"/>
                       <w:jc w:val="center"/>
@@ -42521,7 +42683,7 @@
                       <w:txbxContent>
                         <w:p>
                           <w:pPr>
-                            <w:pStyle w:val="FrameContentsuser"/>
+                            <w:pStyle w:val="FrameContents"/>
                             <w:spacing w:before="178" w:after="0"/>
                             <w:ind w:start="4" w:end="2"/>
                             <w:jc w:val="center"/>
@@ -42556,7 +42718,7 @@
                 <w:txbxContent>
                   <w:p>
                     <w:pPr>
-                      <w:pStyle w:val="FrameContentsuser"/>
+                      <w:pStyle w:val="FrameContents"/>
                       <w:spacing w:before="178" w:after="0"/>
                       <w:ind w:start="4" w:end="2"/>
                       <w:jc w:val="center"/>
@@ -42655,7 +42817,7 @@
                       <w:txbxContent>
                         <w:p>
                           <w:pPr>
-                            <w:pStyle w:val="FrameContentsuser"/>
+                            <w:pStyle w:val="FrameContents"/>
                             <w:spacing w:before="178" w:after="0"/>
                             <w:ind w:start="4" w:end="2"/>
                             <w:jc w:val="center"/>
@@ -42690,7 +42852,7 @@
                 <w:txbxContent>
                   <w:p>
                     <w:pPr>
-                      <w:pStyle w:val="FrameContentsuser"/>
+                      <w:pStyle w:val="FrameContents"/>
                       <w:spacing w:before="178" w:after="0"/>
                       <w:ind w:start="4" w:end="2"/>
                       <w:jc w:val="center"/>
@@ -42775,7 +42937,7 @@
                       <w:txbxContent>
                         <w:p>
                           <w:pPr>
-                            <w:pStyle w:val="FrameContentsuser"/>
+                            <w:pStyle w:val="FrameContents"/>
                             <w:spacing w:before="178" w:after="0"/>
                             <w:ind w:start="4" w:end="2"/>
                             <w:jc w:val="center"/>
@@ -42810,7 +42972,7 @@
                 <w:txbxContent>
                   <w:p>
                     <w:pPr>
-                      <w:pStyle w:val="FrameContentsuser"/>
+                      <w:pStyle w:val="FrameContents"/>
                       <w:spacing w:before="178" w:after="0"/>
                       <w:ind w:start="4" w:end="2"/>
                       <w:jc w:val="center"/>
@@ -42870,7 +43032,7 @@
       <mc:AlternateContent>
         <mc:Choice Requires="wps">
           <w:drawing>
-            <wp:anchor distT="0" distB="0" distL="0" distR="0" simplePos="0" relativeHeight="69" behindDoc="1" locked="0" layoutInCell="0" allowOverlap="1" wp14:anchorId="28AB78F1">
+            <wp:anchor distT="0" distB="0" distL="0" distR="0" simplePos="0" relativeHeight="70" behindDoc="1" locked="0" layoutInCell="0" allowOverlap="1" wp14:anchorId="28AB78F1">
               <wp:simplePos x="0" y="0"/>
               <wp:positionH relativeFrom="page">
                 <wp:posOffset>1663700</wp:posOffset>
@@ -42909,7 +43071,7 @@
                       <w:txbxContent>
                         <w:p>
                           <w:pPr>
-                            <w:pStyle w:val="FrameContentsuser"/>
+                            <w:pStyle w:val="FrameContents"/>
                             <w:spacing w:before="178" w:after="0"/>
                             <w:ind w:start="4" w:end="2"/>
                             <w:jc w:val="center"/>
@@ -42944,7 +43106,7 @@
                 <w:txbxContent>
                   <w:p>
                     <w:pPr>
-                      <w:pStyle w:val="FrameContentsuser"/>
+                      <w:pStyle w:val="FrameContents"/>
                       <w:spacing w:before="178" w:after="0"/>
                       <w:ind w:start="4" w:end="2"/>
                       <w:jc w:val="center"/>
@@ -42990,7 +43152,7 @@
       <mc:AlternateContent>
         <mc:Choice Requires="wps">
           <w:drawing>
-            <wp:anchor distT="0" distB="0" distL="0" distR="0" simplePos="0" relativeHeight="69" behindDoc="1" locked="0" layoutInCell="0" allowOverlap="1" wp14:anchorId="28AB78F1">
+            <wp:anchor distT="0" distB="0" distL="0" distR="0" simplePos="0" relativeHeight="70" behindDoc="1" locked="0" layoutInCell="0" allowOverlap="1" wp14:anchorId="28AB78F1">
               <wp:simplePos x="0" y="0"/>
               <wp:positionH relativeFrom="page">
                 <wp:posOffset>1663700</wp:posOffset>
@@ -43029,7 +43191,7 @@
                       <w:txbxContent>
                         <w:p>
                           <w:pPr>
-                            <w:pStyle w:val="FrameContentsuser"/>
+                            <w:pStyle w:val="FrameContents"/>
                             <w:spacing w:before="178" w:after="0"/>
                             <w:ind w:start="4" w:end="2"/>
                             <w:jc w:val="center"/>
@@ -43064,7 +43226,7 @@
                 <w:txbxContent>
                   <w:p>
                     <w:pPr>
-                      <w:pStyle w:val="FrameContentsuser"/>
+                      <w:pStyle w:val="FrameContents"/>
                       <w:spacing w:before="178" w:after="0"/>
                       <w:ind w:start="4" w:end="2"/>
                       <w:jc w:val="center"/>
@@ -44733,15 +44895,15 @@
       <w:szCs w:val="24"/>
     </w:rPr>
   </w:style>
-  <w:style w:type="paragraph" w:styleId="FrameContentsuser">
-    <w:name w:val="Frame Contents (user)"/>
+  <w:style w:type="paragraph" w:styleId="FrameContents">
+    <w:name w:val="Frame Contents"/>
     <w:basedOn w:val="Normal"/>
     <w:qFormat/>
     <w:pPr/>
     <w:rPr/>
   </w:style>
-  <w:style w:type="paragraph" w:styleId="FrameContents">
-    <w:name w:val="Frame Contents"/>
+  <w:style w:type="paragraph" w:styleId="FrameContentsuser">
+    <w:name w:val="Frame Contents (user)"/>
     <w:basedOn w:val="Normal"/>
     <w:qFormat/>
     <w:pPr/>

</xml_diff>